<commit_message>
se añade la comparación, análisis de requerimientos y fuentes
</commit_message>
<xml_diff>
--- a/Documentación/Documetación II Proyecto BD.docx
+++ b/Documentación/Documetación II Proyecto BD.docx
@@ -374,23 +374,7 @@
     <w:p>
       <w:r>
         <w:tab/>
-        <w:t xml:space="preserve">Tras hacer la evaluación de la infraestructura propuesta por el proveedor saliente contra la carga esperada del estreno mundial, </w:t>
-      </w:r>
-      <w:proofErr w:type="spellStart"/>
-      <w:r>
-        <w:t>esta</w:t>
-      </w:r>
-      <w:proofErr w:type="spellEnd"/>
-      <w:r>
-        <w:t xml:space="preserve"> siendo de 8 millones de usuarios concurrentes, con un pico de 50.000 TPS durante 10min, involucrando transacciones ACID, tener que cumplir PCI-DSS y con retención de auditoria de 5 años, el equipo la rechaza. Ninguno de los 6 componentes cumple con los requisitos mínimos del negocio y varios violan directamente las reglas de negocio y normas de pago. A </w:t>
-      </w:r>
-      <w:proofErr w:type="gramStart"/>
-      <w:r>
-        <w:t>continuación</w:t>
-      </w:r>
-      <w:proofErr w:type="gramEnd"/>
-      <w:r>
-        <w:t xml:space="preserve"> las discrepancias.</w:t>
+        <w:t>Tras hacer la evaluación de la infraestructura propuesta por el proveedor saliente contra la carga esperada del estreno mundial, esta siendo de 8 millones de usuarios concurrentes, con un pico de 50.000 TPS durante 10min, involucrando transacciones ACID, tener que cumplir PCI-DSS y con retención de auditoria de 5 años, el equipo la rechaza. Ninguno de los 6 componentes cumple con los requisitos mínimos del negocio y varios violan directamente las reglas de negocio y normas de pago. A continuación las discrepancias.</w:t>
       </w:r>
     </w:p>
     <w:p>
@@ -457,23 +441,7 @@
         <w:t xml:space="preserve">, es decir </w:t>
       </w:r>
       <w:r>
-        <w:t xml:space="preserve">800 Mbps, 16 veces la capacidad del enlace, y eso sin contar el </w:t>
-      </w:r>
-      <w:proofErr w:type="spellStart"/>
-      <w:r>
-        <w:t>Wi</w:t>
-      </w:r>
-      <w:proofErr w:type="spellEnd"/>
-      <w:r>
-        <w:t xml:space="preserve">-Fi compartido. Un enlace residencial no tiene SLA, ni redundancia, ni protección contra ataques </w:t>
-      </w:r>
-      <w:proofErr w:type="spellStart"/>
-      <w:r>
-        <w:t>DDoS</w:t>
-      </w:r>
-      <w:proofErr w:type="spellEnd"/>
-      <w:r>
-        <w:t>, ni latencia razonable para cines en otros continentes.</w:t>
+        <w:t>800 Mbps, 16 veces la capacidad del enlace, y eso sin contar el Wi-Fi compartido. Un enlace residencial no tiene SLA, ni redundancia, ni protección contra ataques DDoS, ni latencia razonable para cines en otros continentes.</w:t>
       </w:r>
     </w:p>
     <w:p>
@@ -520,16 +488,11 @@
         <w:t>enviarlos en claro a un chat grupal los expone a cualquiera con acceso al grupo. Incumple la RN-09, y el cobro manual por un pasante rompe la atomicidad entre pago y asiento (RN-10 y RN-11). La exposición es legal</w:t>
       </w:r>
       <w:r>
-        <w:t xml:space="preserve"> como multas o </w:t>
-      </w:r>
-      <w:proofErr w:type="gramStart"/>
-      <w:r>
-        <w:t xml:space="preserve">demandas </w:t>
+        <w:t xml:space="preserve"> como multas o demandas </w:t>
       </w:r>
       <w:r>
         <w:t xml:space="preserve"> y</w:t>
       </w:r>
-      <w:proofErr w:type="gramEnd"/>
       <w:r>
         <w:t xml:space="preserve"> además, </w:t>
       </w:r>
@@ -554,29 +517,13 @@
         <w:t xml:space="preserve">. </w:t>
       </w:r>
       <w:r>
-        <w:t xml:space="preserve">No existe plan. Sin </w:t>
-      </w:r>
-      <w:proofErr w:type="spellStart"/>
-      <w:r>
-        <w:t>backups</w:t>
-      </w:r>
-      <w:proofErr w:type="spellEnd"/>
-      <w:r>
-        <w:t xml:space="preserve"> ni réplica, el RPO es toda la información desde la última copia</w:t>
-      </w:r>
-      <w:r>
-        <w:t xml:space="preserve"> que no </w:t>
-      </w:r>
-      <w:proofErr w:type="gramStart"/>
-      <w:r>
-        <w:t xml:space="preserve">existe </w:t>
-      </w:r>
-      <w:r>
-        <w:t xml:space="preserve"> y</w:t>
-      </w:r>
-      <w:proofErr w:type="gramEnd"/>
-      <w:r>
-        <w:t xml:space="preserve"> el RTO es indefinido. Esto contradice el objetivo de disponibilidad</w:t>
+        <w:t>No existe plan. Sin backups ni réplica, el RPO es toda la información desde la última copia</w:t>
+      </w:r>
+      <w:r>
+        <w:t xml:space="preserve"> que no existe </w:t>
+      </w:r>
+      <w:r>
+        <w:t xml:space="preserve"> y el RTO es indefinido. Esto contradice el objetivo de disponibilidad</w:t>
       </w:r>
       <w:r>
         <w:t xml:space="preserve">, que es de </w:t>
@@ -701,21 +648,7 @@
         <w:rPr>
           <w:rFonts w:ascii="Arial" w:hAnsi="Arial" w:cs="Arial"/>
         </w:rPr>
-        <w:t xml:space="preserve">La infraestructura legada no aguanta un estreno mundial, como explicamos en el dictamen. Proponemos una arquitectura en la nube con estas partes. En la entrada va una CDN con WAF y protección contra </w:t>
-      </w:r>
-      <w:proofErr w:type="spellStart"/>
-      <w:r>
-        <w:rPr>
-          <w:rFonts w:ascii="Arial" w:hAnsi="Arial" w:cs="Arial"/>
-        </w:rPr>
-        <w:t>DDoS</w:t>
-      </w:r>
-      <w:proofErr w:type="spellEnd"/>
-      <w:r>
-        <w:rPr>
-          <w:rFonts w:ascii="Arial" w:hAnsi="Arial" w:cs="Arial"/>
-        </w:rPr>
-        <w:t>, más una sala de espera virtual para que los 8 millones de usuarios no lleguen todos al mismo tiempo a la base de datos. La aplicación corre en contenedores que escalan solos según la demanda, con una caché para el mapa de asientos. La base de datos es PostgreSQL administrado, con alta disponibilidad entre zonas y una réplica en otra región. Los pagos pasan por una pasarela externa certificada (en este proyecto se simula). El histórico de 5 años se guarda en almacenamiento de archivo, y lo reciente en almacenamiento rápido.</w:t>
+        <w:t>La infraestructura legada no aguanta un estreno mundial, como explicamos en el dictamen. Proponemos una arquitectura en la nube con estas partes. En la entrada va una CDN con WAF y protección contra DDoS, más una sala de espera virtual para que los 8 millones de usuarios no lleguen todos al mismo tiempo a la base de datos. La aplicación corre en contenedores que escalan solos según la demanda, con una caché para el mapa de asientos. La base de datos es PostgreSQL administrado, con alta disponibilidad entre zonas y una réplica en otra región. Los pagos pasan por una pasarela externa certificada (en este proyecto se simula). El histórico de 5 años se guarda en almacenamiento de archivo, y lo reciente en almacenamiento rápido.</w:t>
       </w:r>
     </w:p>
     <w:p>
@@ -949,14 +882,12 @@
                 <w:rFonts w:ascii="Arial" w:hAnsi="Arial" w:cs="Arial"/>
               </w:rPr>
             </w:pPr>
-            <w:proofErr w:type="spellStart"/>
             <w:r>
               <w:rPr>
                 <w:rFonts w:ascii="Arial" w:hAnsi="Arial" w:cs="Arial"/>
               </w:rPr>
               <w:t>transaccion_log</w:t>
             </w:r>
-            <w:proofErr w:type="spellEnd"/>
           </w:p>
         </w:tc>
         <w:tc>
@@ -1033,14 +964,12 @@
                 <w:rFonts w:ascii="Arial" w:hAnsi="Arial" w:cs="Arial"/>
               </w:rPr>
             </w:pPr>
-            <w:proofErr w:type="spellStart"/>
             <w:r>
               <w:rPr>
                 <w:rFonts w:ascii="Arial" w:hAnsi="Arial" w:cs="Arial"/>
               </w:rPr>
               <w:t>asiento_auditoria_log</w:t>
             </w:r>
-            <w:proofErr w:type="spellEnd"/>
           </w:p>
         </w:tc>
         <w:tc>
@@ -1117,14 +1046,12 @@
                 <w:rFonts w:ascii="Arial" w:hAnsi="Arial" w:cs="Arial"/>
               </w:rPr>
             </w:pPr>
-            <w:proofErr w:type="spellStart"/>
             <w:r>
               <w:rPr>
                 <w:rFonts w:ascii="Arial" w:hAnsi="Arial" w:cs="Arial"/>
               </w:rPr>
               <w:t>acceso_puerta_log</w:t>
             </w:r>
-            <w:proofErr w:type="spellEnd"/>
           </w:p>
         </w:tc>
         <w:tc>
@@ -1201,14 +1128,12 @@
                 <w:rFonts w:ascii="Arial" w:hAnsi="Arial" w:cs="Arial"/>
               </w:rPr>
             </w:pPr>
-            <w:proofErr w:type="spellStart"/>
             <w:r>
               <w:rPr>
                 <w:rFonts w:ascii="Arial" w:hAnsi="Arial" w:cs="Arial"/>
               </w:rPr>
               <w:t>admin_operacion_audit</w:t>
             </w:r>
-            <w:proofErr w:type="spellEnd"/>
           </w:p>
         </w:tc>
         <w:tc>
@@ -1531,19 +1456,11 @@
                 <w:rFonts w:ascii="Arial" w:hAnsi="Arial" w:cs="Arial"/>
               </w:rPr>
             </w:pPr>
-            <w:proofErr w:type="gramStart"/>
-            <w:r>
-              <w:rPr>
-                <w:rFonts w:ascii="Arial" w:hAnsi="Arial" w:cs="Arial"/>
-              </w:rPr>
-              <w:t>Total</w:t>
-            </w:r>
-            <w:proofErr w:type="gramEnd"/>
-            <w:r>
-              <w:rPr>
-                <w:rFonts w:ascii="Arial" w:hAnsi="Arial" w:cs="Arial"/>
-              </w:rPr>
-              <w:t xml:space="preserve"> mensual</w:t>
+            <w:r>
+              <w:rPr>
+                <w:rFonts w:ascii="Arial" w:hAnsi="Arial" w:cs="Arial"/>
+              </w:rPr>
+              <w:t>Total mensual</w:t>
             </w:r>
           </w:p>
         </w:tc>
@@ -1689,35 +1606,7 @@
         <w:rPr>
           <w:rFonts w:ascii="Arial" w:hAnsi="Arial" w:cs="Arial"/>
         </w:rPr>
-        <w:t xml:space="preserve">Acumulado a 5 años: sin crecimiento son 3.6 </w:t>
-      </w:r>
-      <w:proofErr w:type="gramStart"/>
-      <w:r>
-        <w:rPr>
-          <w:rFonts w:ascii="Arial" w:hAnsi="Arial" w:cs="Arial"/>
-        </w:rPr>
-        <w:t>TB  y</w:t>
-      </w:r>
-      <w:proofErr w:type="gramEnd"/>
-      <w:r>
-        <w:rPr>
-          <w:rFonts w:ascii="Arial" w:hAnsi="Arial" w:cs="Arial"/>
-        </w:rPr>
-        <w:t xml:space="preserve"> 8.9 </w:t>
-      </w:r>
-      <w:proofErr w:type="gramStart"/>
-      <w:r>
-        <w:rPr>
-          <w:rFonts w:ascii="Arial" w:hAnsi="Arial" w:cs="Arial"/>
-        </w:rPr>
-        <w:t>TB .</w:t>
-      </w:r>
-      <w:proofErr w:type="gramEnd"/>
-      <w:r>
-        <w:rPr>
-          <w:rFonts w:ascii="Arial" w:hAnsi="Arial" w:cs="Arial"/>
-        </w:rPr>
-        <w:t xml:space="preserve"> Con un crecimiento de 10% anual son 4.4 TB y 10.9 TB. Si en el conservador contamos 3 copias</w:t>
+        <w:t>Acumulado a 5 años: sin crecimiento son 3.6 TB  y 8.9 TB . Con un crecimiento de 10% anual son 4.4 TB y 10.9 TB. Si en el conservador contamos 3 copias</w:t>
       </w:r>
       <w:r>
         <w:rPr>
@@ -1861,69 +1750,27 @@
               <w:rPr>
                 <w:rFonts w:ascii="Arial" w:hAnsi="Arial" w:cs="Arial"/>
               </w:rPr>
-              <w:t xml:space="preserve">Aurora PostgreSQL multirregión con </w:t>
-            </w:r>
-            <w:proofErr w:type="spellStart"/>
-            <w:r>
-              <w:rPr>
-                <w:rFonts w:ascii="Arial" w:hAnsi="Arial" w:cs="Arial"/>
-              </w:rPr>
-              <w:t>autoescalado</w:t>
-            </w:r>
-            <w:proofErr w:type="spellEnd"/>
-            <w:r>
-              <w:rPr>
-                <w:rFonts w:ascii="Arial" w:hAnsi="Arial" w:cs="Arial"/>
-              </w:rPr>
-              <w:t>: 12,500 USD</w:t>
-            </w:r>
-          </w:p>
-        </w:tc>
-        <w:tc>
-          <w:tcPr>
-            <w:tcW w:w="0" w:type="auto"/>
-            <w:hideMark/>
-          </w:tcPr>
-          <w:p>
-            <w:pPr>
-              <w:spacing w:after="160" w:line="259" w:lineRule="auto"/>
-              <w:rPr>
-                <w:rFonts w:ascii="Arial" w:hAnsi="Arial" w:cs="Arial"/>
-              </w:rPr>
-            </w:pPr>
-            <w:r>
-              <w:rPr>
-                <w:rFonts w:ascii="Arial" w:hAnsi="Arial" w:cs="Arial"/>
-              </w:rPr>
-              <w:t xml:space="preserve">Azure </w:t>
-            </w:r>
-            <w:proofErr w:type="spellStart"/>
-            <w:r>
-              <w:rPr>
-                <w:rFonts w:ascii="Arial" w:hAnsi="Arial" w:cs="Arial"/>
-              </w:rPr>
-              <w:t>Database</w:t>
-            </w:r>
-            <w:proofErr w:type="spellEnd"/>
-            <w:r>
-              <w:rPr>
-                <w:rFonts w:ascii="Arial" w:hAnsi="Arial" w:cs="Arial"/>
-              </w:rPr>
-              <w:t xml:space="preserve"> </w:t>
-            </w:r>
-            <w:proofErr w:type="spellStart"/>
-            <w:r>
-              <w:rPr>
-                <w:rFonts w:ascii="Arial" w:hAnsi="Arial" w:cs="Arial"/>
-              </w:rPr>
-              <w:t>for</w:t>
-            </w:r>
-            <w:proofErr w:type="spellEnd"/>
-            <w:r>
-              <w:rPr>
-                <w:rFonts w:ascii="Arial" w:hAnsi="Arial" w:cs="Arial"/>
-              </w:rPr>
-              <w:t xml:space="preserve"> PostgreSQL Flexible Server con alta disponibilidad: 11,800 USD</w:t>
+              <w:t>Aurora PostgreSQL multirregión con autoescalado: 12,500 USD</w:t>
+            </w:r>
+          </w:p>
+        </w:tc>
+        <w:tc>
+          <w:tcPr>
+            <w:tcW w:w="0" w:type="auto"/>
+            <w:hideMark/>
+          </w:tcPr>
+          <w:p>
+            <w:pPr>
+              <w:spacing w:after="160" w:line="259" w:lineRule="auto"/>
+              <w:rPr>
+                <w:rFonts w:ascii="Arial" w:hAnsi="Arial" w:cs="Arial"/>
+              </w:rPr>
+            </w:pPr>
+            <w:r>
+              <w:rPr>
+                <w:rFonts w:ascii="Arial" w:hAnsi="Arial" w:cs="Arial"/>
+              </w:rPr>
+              <w:t>Azure Database for PostgreSQL Flexible Server con alta disponibilidad: 11,800 USD</w:t>
             </w:r>
           </w:p>
         </w:tc>
@@ -1945,49 +1792,27 @@
               <w:rPr>
                 <w:rFonts w:ascii="Arial" w:hAnsi="Arial" w:cs="Arial"/>
               </w:rPr>
-              <w:t xml:space="preserve">Cómputo / </w:t>
-            </w:r>
-            <w:proofErr w:type="spellStart"/>
-            <w:r>
-              <w:rPr>
-                <w:rFonts w:ascii="Arial" w:hAnsi="Arial" w:cs="Arial"/>
-              </w:rPr>
-              <w:t>frontend</w:t>
-            </w:r>
-            <w:proofErr w:type="spellEnd"/>
-          </w:p>
-        </w:tc>
-        <w:tc>
-          <w:tcPr>
-            <w:tcW w:w="0" w:type="auto"/>
-            <w:hideMark/>
-          </w:tcPr>
-          <w:p>
-            <w:pPr>
-              <w:spacing w:after="160" w:line="259" w:lineRule="auto"/>
-              <w:rPr>
-                <w:rFonts w:ascii="Arial" w:hAnsi="Arial" w:cs="Arial"/>
-              </w:rPr>
-            </w:pPr>
-            <w:r>
-              <w:rPr>
-                <w:rFonts w:ascii="Arial" w:hAnsi="Arial" w:cs="Arial"/>
-              </w:rPr>
-              <w:t xml:space="preserve">EKS, 50 </w:t>
-            </w:r>
-            <w:proofErr w:type="spellStart"/>
-            <w:r>
-              <w:rPr>
-                <w:rFonts w:ascii="Arial" w:hAnsi="Arial" w:cs="Arial"/>
-              </w:rPr>
-              <w:t>pods</w:t>
-            </w:r>
-            <w:proofErr w:type="spellEnd"/>
-            <w:r>
-              <w:rPr>
-                <w:rFonts w:ascii="Arial" w:hAnsi="Arial" w:cs="Arial"/>
-              </w:rPr>
-              <w:t xml:space="preserve"> en pico: 6,200 USD</w:t>
+              <w:t>Cómputo / frontend</w:t>
+            </w:r>
+          </w:p>
+        </w:tc>
+        <w:tc>
+          <w:tcPr>
+            <w:tcW w:w="0" w:type="auto"/>
+            <w:hideMark/>
+          </w:tcPr>
+          <w:p>
+            <w:pPr>
+              <w:spacing w:after="160" w:line="259" w:lineRule="auto"/>
+              <w:rPr>
+                <w:rFonts w:ascii="Arial" w:hAnsi="Arial" w:cs="Arial"/>
+              </w:rPr>
+            </w:pPr>
+            <w:r>
+              <w:rPr>
+                <w:rFonts w:ascii="Arial" w:hAnsi="Arial" w:cs="Arial"/>
+              </w:rPr>
+              <w:t>EKS, 50 pods en pico: 6,200 USD</w:t>
             </w:r>
           </w:p>
         </w:tc>
@@ -2107,19 +1932,11 @@
                 <w:rFonts w:ascii="Arial" w:hAnsi="Arial" w:cs="Arial"/>
               </w:rPr>
             </w:pPr>
-            <w:proofErr w:type="spellStart"/>
-            <w:r>
-              <w:rPr>
-                <w:rFonts w:ascii="Arial" w:hAnsi="Arial" w:cs="Arial"/>
-              </w:rPr>
-              <w:t>CloudFront</w:t>
-            </w:r>
-            <w:proofErr w:type="spellEnd"/>
-            <w:r>
-              <w:rPr>
-                <w:rFonts w:ascii="Arial" w:hAnsi="Arial" w:cs="Arial"/>
-              </w:rPr>
-              <w:t xml:space="preserve"> + WAF + Global Accelerator: 3,500 USD</w:t>
+            <w:r>
+              <w:rPr>
+                <w:rFonts w:ascii="Arial" w:hAnsi="Arial" w:cs="Arial"/>
+              </w:rPr>
+              <w:t>CloudFront + WAF + Global Accelerator: 3,500 USD</w:t>
             </w:r>
           </w:p>
         </w:tc>
@@ -2157,19 +1974,11 @@
                 <w:rFonts w:ascii="Arial" w:hAnsi="Arial" w:cs="Arial"/>
               </w:rPr>
             </w:pPr>
-            <w:proofErr w:type="gramStart"/>
-            <w:r>
-              <w:rPr>
-                <w:rFonts w:ascii="Arial" w:hAnsi="Arial" w:cs="Arial"/>
-              </w:rPr>
-              <w:t>Total</w:t>
-            </w:r>
-            <w:proofErr w:type="gramEnd"/>
-            <w:r>
-              <w:rPr>
-                <w:rFonts w:ascii="Arial" w:hAnsi="Arial" w:cs="Arial"/>
-              </w:rPr>
-              <w:t xml:space="preserve"> mensual (OPEX)</w:t>
+            <w:r>
+              <w:rPr>
+                <w:rFonts w:ascii="Arial" w:hAnsi="Arial" w:cs="Arial"/>
+              </w:rPr>
+              <w:t>Total mensual (OPEX)</w:t>
             </w:r>
           </w:p>
         </w:tc>
@@ -2393,21 +2202,7 @@
               <w:rPr>
                 <w:rFonts w:ascii="Arial" w:hAnsi="Arial" w:cs="Arial"/>
               </w:rPr>
-              <w:t xml:space="preserve">Amazon Web </w:t>
-            </w:r>
-            <w:proofErr w:type="spellStart"/>
-            <w:r>
-              <w:rPr>
-                <w:rFonts w:ascii="Arial" w:hAnsi="Arial" w:cs="Arial"/>
-              </w:rPr>
-              <w:t>Services</w:t>
-            </w:r>
-            <w:proofErr w:type="spellEnd"/>
-            <w:r>
-              <w:rPr>
-                <w:rFonts w:ascii="Arial" w:hAnsi="Arial" w:cs="Arial"/>
-              </w:rPr>
-              <w:t xml:space="preserve"> (s. f.-a)</w:t>
+              <w:t>Amazon Web Services (s. f.-a)</w:t>
             </w:r>
           </w:p>
         </w:tc>
@@ -2469,21 +2264,7 @@
               <w:rPr>
                 <w:rFonts w:ascii="Arial" w:hAnsi="Arial" w:cs="Arial"/>
               </w:rPr>
-              <w:t xml:space="preserve">Amazon Web </w:t>
-            </w:r>
-            <w:proofErr w:type="spellStart"/>
-            <w:r>
-              <w:rPr>
-                <w:rFonts w:ascii="Arial" w:hAnsi="Arial" w:cs="Arial"/>
-              </w:rPr>
-              <w:t>Services</w:t>
-            </w:r>
-            <w:proofErr w:type="spellEnd"/>
-            <w:r>
-              <w:rPr>
-                <w:rFonts w:ascii="Arial" w:hAnsi="Arial" w:cs="Arial"/>
-              </w:rPr>
-              <w:t xml:space="preserve"> (s. f.-a)</w:t>
+              <w:t>Amazon Web Services (s. f.-a)</w:t>
             </w:r>
           </w:p>
         </w:tc>
@@ -2545,21 +2326,7 @@
               <w:rPr>
                 <w:rFonts w:ascii="Arial" w:hAnsi="Arial" w:cs="Arial"/>
               </w:rPr>
-              <w:t xml:space="preserve">Amazon Web </w:t>
-            </w:r>
-            <w:proofErr w:type="spellStart"/>
-            <w:r>
-              <w:rPr>
-                <w:rFonts w:ascii="Arial" w:hAnsi="Arial" w:cs="Arial"/>
-              </w:rPr>
-              <w:t>Services</w:t>
-            </w:r>
-            <w:proofErr w:type="spellEnd"/>
-            <w:r>
-              <w:rPr>
-                <w:rFonts w:ascii="Arial" w:hAnsi="Arial" w:cs="Arial"/>
-              </w:rPr>
-              <w:t xml:space="preserve"> (s. f.-a)</w:t>
+              <w:t>Amazon Web Services (s. f.-a)</w:t>
             </w:r>
           </w:p>
         </w:tc>
@@ -2621,21 +2388,7 @@
               <w:rPr>
                 <w:rFonts w:ascii="Arial" w:hAnsi="Arial" w:cs="Arial"/>
               </w:rPr>
-              <w:t xml:space="preserve">Amazon Web </w:t>
-            </w:r>
-            <w:proofErr w:type="spellStart"/>
-            <w:r>
-              <w:rPr>
-                <w:rFonts w:ascii="Arial" w:hAnsi="Arial" w:cs="Arial"/>
-              </w:rPr>
-              <w:t>Services</w:t>
-            </w:r>
-            <w:proofErr w:type="spellEnd"/>
-            <w:r>
-              <w:rPr>
-                <w:rFonts w:ascii="Arial" w:hAnsi="Arial" w:cs="Arial"/>
-              </w:rPr>
-              <w:t xml:space="preserve"> (s. f.-b)</w:t>
+              <w:t>Amazon Web Services (s. f.-b)</w:t>
             </w:r>
           </w:p>
         </w:tc>
@@ -2755,19 +2508,11 @@
                 <w:rFonts w:ascii="Arial" w:hAnsi="Arial" w:cs="Arial"/>
               </w:rPr>
             </w:pPr>
-            <w:proofErr w:type="spellStart"/>
-            <w:r>
-              <w:rPr>
-                <w:rFonts w:ascii="Arial" w:hAnsi="Arial" w:cs="Arial"/>
-              </w:rPr>
-              <w:t>Cloudian</w:t>
-            </w:r>
-            <w:proofErr w:type="spellEnd"/>
-            <w:r>
-              <w:rPr>
-                <w:rFonts w:ascii="Arial" w:hAnsi="Arial" w:cs="Arial"/>
-              </w:rPr>
-              <w:t xml:space="preserve"> (s. f.)</w:t>
+            <w:r>
+              <w:rPr>
+                <w:rFonts w:ascii="Arial" w:hAnsi="Arial" w:cs="Arial"/>
+              </w:rPr>
+              <w:t>Cloudian (s. f.)</w:t>
             </w:r>
           </w:p>
         </w:tc>
@@ -2789,21 +2534,7 @@
               <w:rPr>
                 <w:rFonts w:ascii="Arial" w:hAnsi="Arial" w:cs="Arial"/>
               </w:rPr>
-              <w:t xml:space="preserve">S3 Glacier Flexible </w:t>
-            </w:r>
-            <w:proofErr w:type="spellStart"/>
-            <w:r>
-              <w:rPr>
-                <w:rFonts w:ascii="Arial" w:hAnsi="Arial" w:cs="Arial"/>
-              </w:rPr>
-              <w:t>Retrieval</w:t>
-            </w:r>
-            <w:proofErr w:type="spellEnd"/>
-            <w:r>
-              <w:rPr>
-                <w:rFonts w:ascii="Arial" w:hAnsi="Arial" w:cs="Arial"/>
-              </w:rPr>
-              <w:t xml:space="preserve"> / Deep Archive</w:t>
+              <w:t>S3 Glacier Flexible Retrieval / Deep Archive</w:t>
             </w:r>
           </w:p>
         </w:tc>
@@ -2839,19 +2570,11 @@
                 <w:rFonts w:ascii="Arial" w:hAnsi="Arial" w:cs="Arial"/>
               </w:rPr>
             </w:pPr>
-            <w:proofErr w:type="spellStart"/>
-            <w:r>
-              <w:rPr>
-                <w:rFonts w:ascii="Arial" w:hAnsi="Arial" w:cs="Arial"/>
-              </w:rPr>
-              <w:t>Cloudian</w:t>
-            </w:r>
-            <w:proofErr w:type="spellEnd"/>
-            <w:r>
-              <w:rPr>
-                <w:rFonts w:ascii="Arial" w:hAnsi="Arial" w:cs="Arial"/>
-              </w:rPr>
-              <w:t xml:space="preserve"> (s. f.)</w:t>
+            <w:r>
+              <w:rPr>
+                <w:rFonts w:ascii="Arial" w:hAnsi="Arial" w:cs="Arial"/>
+              </w:rPr>
+              <w:t>Cloudian (s. f.)</w:t>
             </w:r>
           </w:p>
         </w:tc>
@@ -2909,19 +2632,11 @@
                 <w:rFonts w:ascii="Arial" w:hAnsi="Arial" w:cs="Arial"/>
               </w:rPr>
             </w:pPr>
-            <w:proofErr w:type="spellStart"/>
-            <w:r>
-              <w:rPr>
-                <w:rFonts w:ascii="Arial" w:hAnsi="Arial" w:cs="Arial"/>
-              </w:rPr>
-              <w:t>CloudZero</w:t>
-            </w:r>
-            <w:proofErr w:type="spellEnd"/>
-            <w:r>
-              <w:rPr>
-                <w:rFonts w:ascii="Arial" w:hAnsi="Arial" w:cs="Arial"/>
-              </w:rPr>
-              <w:t xml:space="preserve"> (2026)</w:t>
+            <w:r>
+              <w:rPr>
+                <w:rFonts w:ascii="Arial" w:hAnsi="Arial" w:cs="Arial"/>
+              </w:rPr>
+              <w:t>CloudZero (2026)</w:t>
             </w:r>
           </w:p>
         </w:tc>
@@ -2979,19 +2694,11 @@
                 <w:rFonts w:ascii="Arial" w:hAnsi="Arial" w:cs="Arial"/>
               </w:rPr>
             </w:pPr>
-            <w:proofErr w:type="spellStart"/>
-            <w:r>
-              <w:rPr>
-                <w:rFonts w:ascii="Arial" w:hAnsi="Arial" w:cs="Arial"/>
-              </w:rPr>
-              <w:t>Bytebase</w:t>
-            </w:r>
-            <w:proofErr w:type="spellEnd"/>
-            <w:r>
-              <w:rPr>
-                <w:rFonts w:ascii="Arial" w:hAnsi="Arial" w:cs="Arial"/>
-              </w:rPr>
-              <w:t xml:space="preserve"> (s. f.)</w:t>
+            <w:r>
+              <w:rPr>
+                <w:rFonts w:ascii="Arial" w:hAnsi="Arial" w:cs="Arial"/>
+              </w:rPr>
+              <w:t>Bytebase (s. f.)</w:t>
             </w:r>
           </w:p>
         </w:tc>
@@ -3428,19 +3135,11 @@
                 <w:rFonts w:ascii="Arial" w:hAnsi="Arial" w:cs="Arial"/>
               </w:rPr>
             </w:pPr>
-            <w:proofErr w:type="gramStart"/>
-            <w:r>
-              <w:rPr>
-                <w:rFonts w:ascii="Arial" w:hAnsi="Arial" w:cs="Arial"/>
-              </w:rPr>
-              <w:t>Total</w:t>
-            </w:r>
-            <w:proofErr w:type="gramEnd"/>
-            <w:r>
-              <w:rPr>
-                <w:rFonts w:ascii="Arial" w:hAnsi="Arial" w:cs="Arial"/>
-              </w:rPr>
-              <w:t xml:space="preserve"> a 3 años</w:t>
+            <w:r>
+              <w:rPr>
+                <w:rFonts w:ascii="Arial" w:hAnsi="Arial" w:cs="Arial"/>
+              </w:rPr>
+              <w:t>Total a 3 años</w:t>
             </w:r>
           </w:p>
         </w:tc>
@@ -3618,21 +3317,7 @@
         <w:rPr>
           <w:rFonts w:ascii="Arial" w:hAnsi="Arial" w:cs="Arial"/>
         </w:rPr>
-        <w:t xml:space="preserve">La solución necesita un equipo de operación (DevOps y DBA) con monitoreo y soporte durante los estrenos, guías para atender incidentes y pruebas de carga antes de cada estreno grande. También hay que capacitar al personal de taquilla, puerta y contabilidad según su rol. La migración se haría por fases: primero unos cines piloto y después el resto, para no depender de una sola fecha de cambio. Como son servicios administrados, parches, respaldos y </w:t>
-      </w:r>
-      <w:proofErr w:type="spellStart"/>
-      <w:r>
-        <w:rPr>
-          <w:rFonts w:ascii="Arial" w:hAnsi="Arial" w:cs="Arial"/>
-        </w:rPr>
-        <w:t>failover</w:t>
-      </w:r>
-      <w:proofErr w:type="spellEnd"/>
-      <w:r>
-        <w:rPr>
-          <w:rFonts w:ascii="Arial" w:hAnsi="Arial" w:cs="Arial"/>
-        </w:rPr>
-        <w:t xml:space="preserve"> los maneja el proveedor, y eso baja mucho el trabajo de operación.</w:t>
+        <w:t>La solución necesita un equipo de operación (DevOps y DBA) con monitoreo y soporte durante los estrenos, guías para atender incidentes y pruebas de carga antes de cada estreno grande. También hay que capacitar al personal de taquilla, puerta y contabilidad según su rol. La migración se haría por fases: primero unos cines piloto y después el resto, para no depender de una sola fecha de cambio. Como son servicios administrados, parches, respaldos y failover los maneja el proveedor, y eso baja mucho el trabajo de operación.</w:t>
       </w:r>
     </w:p>
     <w:p>
@@ -3878,19 +3563,11 @@
                 <w:rFonts w:ascii="Arial" w:hAnsi="Arial" w:cs="Arial"/>
               </w:rPr>
             </w:pPr>
-            <w:proofErr w:type="spellStart"/>
-            <w:r>
-              <w:rPr>
-                <w:rFonts w:ascii="Arial" w:hAnsi="Arial" w:cs="Arial"/>
-              </w:rPr>
-              <w:t>Failover</w:t>
-            </w:r>
-            <w:proofErr w:type="spellEnd"/>
-            <w:r>
-              <w:rPr>
-                <w:rFonts w:ascii="Arial" w:hAnsi="Arial" w:cs="Arial"/>
-              </w:rPr>
-              <w:t xml:space="preserve"> automático a una réplica en otra zona y réplica multirregión</w:t>
+            <w:r>
+              <w:rPr>
+                <w:rFonts w:ascii="Arial" w:hAnsi="Arial" w:cs="Arial"/>
+              </w:rPr>
+              <w:t>Failover automático a una réplica en otra zona y réplica multirregión</w:t>
             </w:r>
           </w:p>
         </w:tc>
@@ -4074,21 +3751,7 @@
               <w:rPr>
                 <w:rFonts w:ascii="Arial" w:hAnsi="Arial" w:cs="Arial"/>
               </w:rPr>
-              <w:t>Ataque de denegación de servicio (</w:t>
-            </w:r>
-            <w:proofErr w:type="spellStart"/>
-            <w:r>
-              <w:rPr>
-                <w:rFonts w:ascii="Arial" w:hAnsi="Arial" w:cs="Arial"/>
-              </w:rPr>
-              <w:t>DDoS</w:t>
-            </w:r>
-            <w:proofErr w:type="spellEnd"/>
-            <w:r>
-              <w:rPr>
-                <w:rFonts w:ascii="Arial" w:hAnsi="Arial" w:cs="Arial"/>
-              </w:rPr>
-              <w:t>)</w:t>
+              <w:t>Ataque de denegación de servicio (DDoS)</w:t>
             </w:r>
           </w:p>
         </w:tc>
@@ -4400,19 +4063,11 @@
                 <w:rFonts w:ascii="Arial" w:hAnsi="Arial" w:cs="Arial"/>
               </w:rPr>
             </w:pPr>
-            <w:proofErr w:type="spellStart"/>
-            <w:r>
-              <w:rPr>
-                <w:rFonts w:ascii="Arial" w:hAnsi="Arial" w:cs="Arial"/>
-              </w:rPr>
-              <w:t>Autoescalado</w:t>
-            </w:r>
-            <w:proofErr w:type="spellEnd"/>
-            <w:r>
-              <w:rPr>
-                <w:rFonts w:ascii="Arial" w:hAnsi="Arial" w:cs="Arial"/>
-              </w:rPr>
-              <w:t>, réplicas de lectura, caché de disponibilidad, colas y pruebas de carga antes del estreno</w:t>
+            <w:r>
+              <w:rPr>
+                <w:rFonts w:ascii="Arial" w:hAnsi="Arial" w:cs="Arial"/>
+              </w:rPr>
+              <w:t>Autoescalado, réplicas de lectura, caché de disponibilidad, colas y pruebas de carga antes del estreno</w:t>
             </w:r>
           </w:p>
         </w:tc>
@@ -4913,16 +4568,8 @@
               <w:rPr>
                 <w:rFonts w:ascii="Arial" w:hAnsi="Arial" w:cs="Arial"/>
               </w:rPr>
-              <w:t xml:space="preserve">QR firmado y único, validación de un solo uso (RN-14) y registro en </w:t>
-            </w:r>
-            <w:proofErr w:type="spellStart"/>
-            <w:r>
-              <w:rPr>
-                <w:rFonts w:ascii="Arial" w:hAnsi="Arial" w:cs="Arial"/>
-              </w:rPr>
-              <w:t>acceso_puerta_log</w:t>
-            </w:r>
-            <w:proofErr w:type="spellEnd"/>
+              <w:t>QR firmado y único, validación de un solo uso (RN-14) y registro en acceso_puerta_log</w:t>
+            </w:r>
           </w:p>
         </w:tc>
         <w:tc>
@@ -5043,21 +4690,7 @@
               <w:rPr>
                 <w:rFonts w:ascii="Arial" w:hAnsi="Arial" w:cs="Arial"/>
               </w:rPr>
-              <w:t xml:space="preserve">RBAC y bitácora </w:t>
-            </w:r>
-            <w:proofErr w:type="spellStart"/>
-            <w:r>
-              <w:rPr>
-                <w:rFonts w:ascii="Arial" w:hAnsi="Arial" w:cs="Arial"/>
-              </w:rPr>
-              <w:t>admin_operacion_audit</w:t>
-            </w:r>
-            <w:proofErr w:type="spellEnd"/>
-            <w:r>
-              <w:rPr>
-                <w:rFonts w:ascii="Arial" w:hAnsi="Arial" w:cs="Arial"/>
-              </w:rPr>
-              <w:t xml:space="preserve"> con fecha, IP, rol y usuario, más revisión periódica</w:t>
+              <w:t>RBAC y bitácora admin_operacion_audit con fecha, IP, rol y usuario, más revisión periódica</w:t>
             </w:r>
           </w:p>
         </w:tc>
@@ -5254,6 +4887,710 @@
         </w:rPr>
         <w:t>Análisis de requisitos y dimensionamiento de datos</w:t>
       </w:r>
+    </w:p>
+    <w:p/>
+    <w:p>
+      <w:pPr>
+        <w:rPr>
+          <w:rFonts w:ascii="Arial" w:hAnsi="Arial" w:cs="Arial"/>
+        </w:rPr>
+      </w:pPr>
+      <w:r>
+        <w:rPr>
+          <w:rFonts w:ascii="Arial" w:hAnsi="Arial" w:cs="Arial"/>
+        </w:rPr>
+        <w:t xml:space="preserve">2.1 requisitos funcionales </w:t>
+      </w:r>
+    </w:p>
+    <w:p>
+      <w:pPr>
+        <w:rPr>
+          <w:rFonts w:ascii="Arial" w:hAnsi="Arial" w:cs="Arial"/>
+        </w:rPr>
+      </w:pPr>
+      <w:r>
+        <w:rPr>
+          <w:rFonts w:ascii="Arial" w:hAnsi="Arial" w:cs="Arial"/>
+        </w:rPr>
+        <w:t>RF-01. Mostrar solo las funciones activas con inicio futuro, con título, sinopsis, clasificación, horarios y ubicación de la sala, y poder filtrarlas por ubicación, fecha y género. Reglas relacionadas: RN-01 y RN-02.</w:t>
+      </w:r>
+    </w:p>
+    <w:p>
+      <w:pPr>
+        <w:rPr>
+          <w:rFonts w:ascii="Arial" w:hAnsi="Arial" w:cs="Arial"/>
+        </w:rPr>
+      </w:pPr>
+      <w:r>
+        <w:rPr>
+          <w:rFonts w:ascii="Arial" w:hAnsi="Arial" w:cs="Arial"/>
+        </w:rPr>
+        <w:br/>
+        <w:t>RF-02. Mostrar el mapa de la sala en tiempo real, por zonas, con los estados disponible, ocupado, reservado y bloqueado. Regla relacionada: RN-03.</w:t>
+      </w:r>
+    </w:p>
+    <w:p>
+      <w:pPr>
+        <w:rPr>
+          <w:rFonts w:ascii="Arial" w:hAnsi="Arial" w:cs="Arial"/>
+        </w:rPr>
+      </w:pPr>
+      <w:r>
+        <w:rPr>
+          <w:rFonts w:ascii="Arial" w:hAnsi="Arial" w:cs="Arial"/>
+        </w:rPr>
+        <w:br/>
+        <w:t>RF-03. Limitar el máximo de asientos por transacción, con el valor configurable. Regla relacionada: RN-04.</w:t>
+      </w:r>
+    </w:p>
+    <w:p>
+      <w:pPr>
+        <w:rPr>
+          <w:rFonts w:ascii="Arial" w:hAnsi="Arial" w:cs="Arial"/>
+        </w:rPr>
+      </w:pPr>
+      <w:r>
+        <w:rPr>
+          <w:rFonts w:ascii="Arial" w:hAnsi="Arial" w:cs="Arial"/>
+        </w:rPr>
+        <w:lastRenderedPageBreak/>
+        <w:br/>
+        <w:t>RF-04. Bloquear los asientos elegidos por 2 minutos y liberarlos solos si el tiempo se acaba. Regla relacionada: RN-05.</w:t>
+      </w:r>
+    </w:p>
+    <w:p>
+      <w:pPr>
+        <w:rPr>
+          <w:rFonts w:ascii="Arial" w:hAnsi="Arial" w:cs="Arial"/>
+        </w:rPr>
+      </w:pPr>
+      <w:r>
+        <w:rPr>
+          <w:rFonts w:ascii="Arial" w:hAnsi="Arial" w:cs="Arial"/>
+        </w:rPr>
+        <w:br/>
+        <w:t>RF-05. Manejar tarifas por perfil</w:t>
+      </w:r>
+      <w:r>
+        <w:rPr>
+          <w:rFonts w:ascii="Arial" w:hAnsi="Arial" w:cs="Arial"/>
+        </w:rPr>
+        <w:t xml:space="preserve"> es decir </w:t>
+      </w:r>
+      <w:r>
+        <w:rPr>
+          <w:rFonts w:ascii="Arial" w:hAnsi="Arial" w:cs="Arial"/>
+        </w:rPr>
+        <w:t>adulto, niño, tercera edad, estudiante</w:t>
+      </w:r>
+      <w:r>
+        <w:rPr>
+          <w:rFonts w:ascii="Arial" w:hAnsi="Arial" w:cs="Arial"/>
+        </w:rPr>
+        <w:t>. A</w:t>
+      </w:r>
+      <w:r>
+        <w:rPr>
+          <w:rFonts w:ascii="Arial" w:hAnsi="Arial" w:cs="Arial"/>
+        </w:rPr>
+        <w:t>plicar las promociones automáticamente como el 2x1 y calcular el total exacto con los cargos por servicio. Reglas relacionadas: RN-06, RN-07 y RN-08.</w:t>
+      </w:r>
+    </w:p>
+    <w:p>
+      <w:pPr>
+        <w:rPr>
+          <w:rFonts w:ascii="Arial" w:hAnsi="Arial" w:cs="Arial"/>
+        </w:rPr>
+      </w:pPr>
+      <w:r>
+        <w:rPr>
+          <w:rFonts w:ascii="Arial" w:hAnsi="Arial" w:cs="Arial"/>
+        </w:rPr>
+        <w:br/>
+        <w:t>RF-06. Procesar el pago simulado por medio de una pasarela, sin guardar datos sensibles como el CVV. Si el pago se rechaza, se cancela la compra y los asientos se liberan de inmediato. Reglas relacionadas: RN-09 y RN-10.</w:t>
+      </w:r>
+    </w:p>
+    <w:p>
+      <w:pPr>
+        <w:rPr>
+          <w:rFonts w:ascii="Arial" w:hAnsi="Arial" w:cs="Arial"/>
+        </w:rPr>
+      </w:pPr>
+      <w:r>
+        <w:rPr>
+          <w:rFonts w:ascii="Arial" w:hAnsi="Arial" w:cs="Arial"/>
+        </w:rPr>
+        <w:br/>
+        <w:t>RF-07. Emitir el comprobante con un QR único por función, localidad y asiento, solo cuando el pago ya fue aprobado, y dejarlo disponible en el perfil del cliente. Reglas relacionadas: RN-11, RN-12 y RN-13.</w:t>
+      </w:r>
+    </w:p>
+    <w:p>
+      <w:pPr>
+        <w:rPr>
+          <w:rFonts w:ascii="Arial" w:hAnsi="Arial" w:cs="Arial"/>
+        </w:rPr>
+      </w:pPr>
+      <w:r>
+        <w:rPr>
+          <w:rFonts w:ascii="Arial" w:hAnsi="Arial" w:cs="Arial"/>
+        </w:rPr>
+        <w:br/>
+        <w:t>RF-08. Validar el QR en la puerta una sola vez</w:t>
+      </w:r>
+      <w:r>
+        <w:rPr>
+          <w:rFonts w:ascii="Arial" w:hAnsi="Arial" w:cs="Arial"/>
+        </w:rPr>
+        <w:t xml:space="preserve">, </w:t>
+      </w:r>
+      <w:r>
+        <w:rPr>
+          <w:rFonts w:ascii="Arial" w:hAnsi="Arial" w:cs="Arial"/>
+        </w:rPr>
+        <w:t>si se intenta de nuevo, mostrar “Entrada ya utilizada”, revisar que sea de la función y horario correctos y respetar la tolerancia de 30 minutos antes a 15 minutos después del inicio. Reglas relacionadas: RN-14, RN-15 y RN-16.</w:t>
+      </w:r>
+    </w:p>
+    <w:p>
+      <w:pPr>
+        <w:rPr>
+          <w:rFonts w:ascii="Arial" w:hAnsi="Arial" w:cs="Arial"/>
+        </w:rPr>
+      </w:pPr>
+      <w:r>
+        <w:rPr>
+          <w:rFonts w:ascii="Arial" w:hAnsi="Arial" w:cs="Arial"/>
+        </w:rPr>
+        <w:br/>
+        <w:t>RF-09. Manejar los roles</w:t>
+      </w:r>
+      <w:r>
+        <w:rPr>
+          <w:rFonts w:ascii="Arial" w:hAnsi="Arial" w:cs="Arial"/>
+        </w:rPr>
+        <w:t xml:space="preserve"> </w:t>
+      </w:r>
+      <w:r>
+        <w:rPr>
+          <w:rFonts w:ascii="Arial" w:hAnsi="Arial" w:cs="Arial"/>
+        </w:rPr>
+        <w:t>cliente, taquillero, operador de sala, contador y administrador con los permisos mínimos que indica la matriz del enunciado. Regla relacionada: RN-17.</w:t>
+      </w:r>
+      <w:r>
+        <w:rPr>
+          <w:rFonts w:ascii="Arial" w:hAnsi="Arial" w:cs="Arial"/>
+        </w:rPr>
+        <w:br/>
+        <w:t>RF-10. Permitir al administrador gestionar películas, salas, mapas de asientos, funciones sin traslapes de horario y la matriz de precios, sin poder modificar una sala que ya tiene entradas vendidas o reservadas. Regla relacionada: RN-18.</w:t>
+      </w:r>
+    </w:p>
+    <w:p>
+      <w:pPr>
+        <w:rPr>
+          <w:rFonts w:ascii="Arial" w:hAnsi="Arial" w:cs="Arial"/>
+        </w:rPr>
+      </w:pPr>
+      <w:r>
+        <w:rPr>
+          <w:rFonts w:ascii="Arial" w:hAnsi="Arial" w:cs="Arial"/>
+        </w:rPr>
+        <w:br/>
+        <w:t>RF-11. Permitir cancelaciones y reembolsos según la política del cine</w:t>
+      </w:r>
+      <w:r>
+        <w:rPr>
+          <w:rFonts w:ascii="Arial" w:hAnsi="Arial" w:cs="Arial"/>
+        </w:rPr>
+        <w:t xml:space="preserve">, </w:t>
+      </w:r>
+      <w:r>
+        <w:rPr>
+          <w:rFonts w:ascii="Arial" w:hAnsi="Arial" w:cs="Arial"/>
+        </w:rPr>
+        <w:t>por ejemplo, hasta 2 horas antes de la función, liberando el asiento. Regla relacionada: RN-19.</w:t>
+      </w:r>
+    </w:p>
+    <w:p>
+      <w:pPr>
+        <w:rPr>
+          <w:rFonts w:ascii="Arial" w:hAnsi="Arial" w:cs="Arial"/>
+        </w:rPr>
+      </w:pPr>
+      <w:r>
+        <w:rPr>
+          <w:rFonts w:ascii="Arial" w:hAnsi="Arial" w:cs="Arial"/>
+        </w:rPr>
+        <w:br/>
+        <w:t>RF-12. Llevar cuatro bitácoras de auditoría con retención de 5 años: transaccion_log, asiento_auditoria_log, acceso_puerta_log y admin_operacion_audit. Regla relacionada: RN-20.</w:t>
+      </w:r>
+    </w:p>
+    <w:p>
+      <w:pPr>
+        <w:rPr>
+          <w:rFonts w:ascii="Arial" w:hAnsi="Arial" w:cs="Arial"/>
+        </w:rPr>
+      </w:pPr>
+      <w:r>
+        <w:rPr>
+          <w:rFonts w:ascii="Arial" w:hAnsi="Arial" w:cs="Arial"/>
+        </w:rPr>
+        <w:br/>
+        <w:t>RF-13. Ofrecer las consultas analíticas de la gerencia: ocupación y recaudación por función, top 5 de películas de la última semana, métodos de pago en porcentaje y auditoría de operaciones críticas del último mes por administrador. Origen: consultas analíticas mínimas del enunciado.</w:t>
+      </w:r>
+    </w:p>
+    <w:p>
+      <w:pPr>
+        <w:rPr>
+          <w:rFonts w:ascii="Arial" w:hAnsi="Arial" w:cs="Arial"/>
+        </w:rPr>
+      </w:pPr>
+      <w:r>
+        <w:rPr>
+          <w:rFonts w:ascii="Arial" w:hAnsi="Arial" w:cs="Arial"/>
+        </w:rPr>
+        <w:br/>
+        <w:t>RF-14. Permitir la conciliación bancaria y los cortes de ingresos diarios, semanales y mensuales. Origen: proceso de gestión financiera y reembolsos.</w:t>
+      </w:r>
+    </w:p>
+    <w:p>
+      <w:pPr>
+        <w:rPr>
+          <w:rFonts w:ascii="Arial" w:hAnsi="Arial" w:cs="Arial"/>
+        </w:rPr>
+      </w:pPr>
+      <w:r>
+        <w:rPr>
+          <w:rFonts w:ascii="Arial" w:hAnsi="Arial" w:cs="Arial"/>
+        </w:rPr>
+        <w:lastRenderedPageBreak/>
+        <w:br/>
+        <w:t>RF-15. Permitir resolver incidencias de acceso en puerta, como un QR ilegible o un cliente fuera del tiempo de tolerancia. Origen: proceso de control de acceso.</w:t>
+      </w:r>
+    </w:p>
+    <w:p>
+      <w:pPr>
+        <w:rPr>
+          <w:rFonts w:ascii="Arial" w:hAnsi="Arial" w:cs="Arial"/>
+        </w:rPr>
+      </w:pPr>
+      <w:r>
+        <w:rPr>
+          <w:rFonts w:ascii="Arial" w:hAnsi="Arial" w:cs="Arial"/>
+        </w:rPr>
+        <w:br/>
+        <w:t>RF-16. Mostrar en el panel de administración las métricas en tiempo real. Origen: panel de administración.</w:t>
+      </w:r>
+    </w:p>
+    <w:p>
+      <w:pPr>
+        <w:rPr>
+          <w:rFonts w:ascii="Arial" w:hAnsi="Arial" w:cs="Arial"/>
+        </w:rPr>
+      </w:pPr>
+    </w:p>
+    <w:p>
+      <w:pPr>
+        <w:rPr>
+          <w:rFonts w:ascii="Arial" w:hAnsi="Arial" w:cs="Arial"/>
+        </w:rPr>
+      </w:pPr>
+      <w:r>
+        <w:rPr>
+          <w:rFonts w:ascii="Arial" w:hAnsi="Arial" w:cs="Arial"/>
+        </w:rPr>
+        <w:t>2.2 Requisitos no funcionales</w:t>
+      </w:r>
+    </w:p>
+    <w:p>
+      <w:pPr>
+        <w:rPr>
+          <w:rFonts w:ascii="Arial" w:hAnsi="Arial" w:cs="Arial"/>
+        </w:rPr>
+      </w:pPr>
+      <w:r>
+        <w:rPr>
+          <w:rFonts w:ascii="Arial" w:hAnsi="Arial" w:cs="Arial"/>
+        </w:rPr>
+        <w:t>RNF-01. Rendimiento: soportar el pico de 50,000 TPS durante 10 minutos. Los 8 millones de usuarios no llegan todos a la base de datos, porque la CDN, la caché y la sala de espera virtual absorben la mayor parte.</w:t>
+      </w:r>
+    </w:p>
+    <w:p>
+      <w:pPr>
+        <w:rPr>
+          <w:rFonts w:ascii="Arial" w:hAnsi="Arial" w:cs="Arial"/>
+        </w:rPr>
+      </w:pPr>
+      <w:r>
+        <w:rPr>
+          <w:rFonts w:ascii="Arial" w:hAnsi="Arial" w:cs="Arial"/>
+        </w:rPr>
+        <w:br/>
+        <w:t>RNF-02. Disponibilidad: 99.99%, que son unos 52 minutos de caída al año como máximo.</w:t>
+      </w:r>
+    </w:p>
+    <w:p>
+      <w:pPr>
+        <w:rPr>
+          <w:rFonts w:ascii="Arial" w:hAnsi="Arial" w:cs="Arial"/>
+        </w:rPr>
+      </w:pPr>
+      <w:r>
+        <w:rPr>
+          <w:rFonts w:ascii="Arial" w:hAnsi="Arial" w:cs="Arial"/>
+        </w:rPr>
+        <w:br/>
+        <w:t>RNF-03. Recuperación: RPO de 5 segundos o menos y RTO menor a 5 minutos.</w:t>
+      </w:r>
+    </w:p>
+    <w:p>
+      <w:pPr>
+        <w:rPr>
+          <w:rFonts w:ascii="Arial" w:hAnsi="Arial" w:cs="Arial"/>
+        </w:rPr>
+      </w:pPr>
+      <w:r>
+        <w:rPr>
+          <w:rFonts w:ascii="Arial" w:hAnsi="Arial" w:cs="Arial"/>
+        </w:rPr>
+        <w:br/>
+        <w:t>RNF-04. Consistencia: transacciones ACID y una restricción de unicidad por función y asiento que impida la doble venta.</w:t>
+      </w:r>
+    </w:p>
+    <w:p>
+      <w:pPr>
+        <w:rPr>
+          <w:rFonts w:ascii="Arial" w:hAnsi="Arial" w:cs="Arial"/>
+        </w:rPr>
+      </w:pPr>
+      <w:r>
+        <w:rPr>
+          <w:rFonts w:ascii="Arial" w:hAnsi="Arial" w:cs="Arial"/>
+        </w:rPr>
+        <w:br/>
+        <w:t>RNF-05. Seguridad: cumplir PCI-DSS sin guardar el número completo de la tarjeta ni el CVV, cifrar los datos en tránsito y en reposo, usar WAF y protección DDoS y dar a cada rol solo los permisos que necesita.</w:t>
+      </w:r>
+    </w:p>
+    <w:p>
+      <w:pPr>
+        <w:rPr>
+          <w:rFonts w:ascii="Arial" w:hAnsi="Arial" w:cs="Arial"/>
+        </w:rPr>
+      </w:pPr>
+      <w:r>
+        <w:rPr>
+          <w:rFonts w:ascii="Arial" w:hAnsi="Arial" w:cs="Arial"/>
+        </w:rPr>
+        <w:br/>
+        <w:t>RNF-06. Retención: guardar los logs 5 años, en tablas separadas por tipo, particionadas por fecha y de solo inserción para que no se puedan alterar.</w:t>
+      </w:r>
+    </w:p>
+    <w:p>
+      <w:pPr>
+        <w:rPr>
+          <w:rFonts w:ascii="Arial" w:hAnsi="Arial" w:cs="Arial"/>
+        </w:rPr>
+      </w:pPr>
+      <w:r>
+        <w:rPr>
+          <w:rFonts w:ascii="Arial" w:hAnsi="Arial" w:cs="Arial"/>
+        </w:rPr>
+        <w:br/>
+        <w:t>RNF-07. Escalabilidad: que el cómputo crezca según la demanda y que haya réplicas de lectura.</w:t>
+      </w:r>
+    </w:p>
+    <w:p>
+      <w:pPr>
+        <w:rPr>
+          <w:rFonts w:ascii="Arial" w:hAnsi="Arial" w:cs="Arial"/>
+        </w:rPr>
+      </w:pPr>
+      <w:r>
+        <w:rPr>
+          <w:rFonts w:ascii="Arial" w:hAnsi="Arial" w:cs="Arial"/>
+        </w:rPr>
+        <w:br/>
+        <w:t>RNF-08. Tiempo de respuesta: proponemos como meta que el 95% de las consultas de disponibilidad de asientos respondan en menos de 200 ms, y lo comprobamos con EXPLAIN ANALYZE.</w:t>
+      </w:r>
+    </w:p>
+    <w:p>
+      <w:pPr>
+        <w:rPr>
+          <w:rFonts w:ascii="Arial" w:hAnsi="Arial" w:cs="Arial"/>
+        </w:rPr>
+      </w:pPr>
+      <w:r>
+        <w:rPr>
+          <w:rFonts w:ascii="Arial" w:hAnsi="Arial" w:cs="Arial"/>
+        </w:rPr>
+        <w:br/>
+        <w:t>RNF-09. Privacidad: proteger los datos personales de los clientes y limitar quién puede verlos.</w:t>
+      </w:r>
+    </w:p>
+    <w:p>
+      <w:pPr>
+        <w:rPr>
+          <w:rFonts w:ascii="Arial" w:hAnsi="Arial" w:cs="Arial"/>
+        </w:rPr>
+      </w:pPr>
+      <w:r>
+        <w:rPr>
+          <w:rFonts w:ascii="Arial" w:hAnsi="Arial" w:cs="Arial"/>
+        </w:rPr>
+        <w:br/>
+        <w:t>RNF-10. Usabilidad: interfaz funcional en distintos dispositivos.</w:t>
+      </w:r>
+    </w:p>
+    <w:p>
+      <w:pPr>
+        <w:rPr>
+          <w:rFonts w:ascii="Arial" w:hAnsi="Arial" w:cs="Arial"/>
+        </w:rPr>
+      </w:pPr>
+      <w:r>
+        <w:rPr>
+          <w:rFonts w:ascii="Arial" w:hAnsi="Arial" w:cs="Arial"/>
+        </w:rPr>
+        <w:br/>
+        <w:t>RNF-11. Operación: monitoreo, alertas y respaldos automáticos.</w:t>
+      </w:r>
+    </w:p>
+    <w:p>
+      <w:pPr>
+        <w:rPr>
+          <w:rFonts w:ascii="Arial" w:hAnsi="Arial" w:cs="Arial"/>
+        </w:rPr>
+      </w:pPr>
+    </w:p>
+    <w:p>
+      <w:pPr>
+        <w:rPr>
+          <w:rFonts w:ascii="Arial" w:hAnsi="Arial" w:cs="Arial"/>
+        </w:rPr>
+      </w:pPr>
+      <w:r>
+        <w:rPr>
+          <w:rFonts w:ascii="Arial" w:hAnsi="Arial" w:cs="Arial"/>
+        </w:rPr>
+        <w:t>2.3 Volúmenes de datos</w:t>
+      </w:r>
+    </w:p>
+    <w:p>
+      <w:pPr>
+        <w:rPr>
+          <w:rFonts w:ascii="Arial" w:hAnsi="Arial" w:cs="Arial"/>
+        </w:rPr>
+      </w:pPr>
+      <w:r>
+        <w:rPr>
+          <w:rFonts w:ascii="Arial" w:hAnsi="Arial" w:cs="Arial"/>
+        </w:rPr>
+        <w:t>Datos del enunciado: 8,000,000 de usuarios concurrentes, 50,000 TPS de pico durante 10 minutos</w:t>
+      </w:r>
+      <w:r>
+        <w:rPr>
+          <w:rFonts w:ascii="Arial" w:hAnsi="Arial" w:cs="Arial"/>
+        </w:rPr>
+        <w:t xml:space="preserve">, </w:t>
+      </w:r>
+      <w:r>
+        <w:rPr>
+          <w:rFonts w:ascii="Arial" w:hAnsi="Arial" w:cs="Arial"/>
+        </w:rPr>
+        <w:t>30 millones de transacciones en ese tiempo, 500 títulos activos, 1,500 salas y 15 millones de boletos al mes, con 5 años de retención.</w:t>
+      </w:r>
+    </w:p>
+    <w:p>
+      <w:pPr>
+        <w:rPr>
+          <w:rFonts w:ascii="Arial" w:hAnsi="Arial" w:cs="Arial"/>
+        </w:rPr>
+      </w:pPr>
+      <w:r>
+        <w:rPr>
+          <w:rFonts w:ascii="Arial" w:hAnsi="Arial" w:cs="Arial"/>
+        </w:rPr>
+        <w:t>Lo que sale de ahí: 15,000,000 entre los 2,592,000 segundos de un mes dan 5.8 TPS promedio, así que el pico es unas 8,640 veces el promedio. Por eso el sistema se diseña para el pico y no para el promedio. Cada sala vende unos 10,000 boletos al mes</w:t>
+      </w:r>
+      <w:r>
+        <w:rPr>
+          <w:rFonts w:ascii="Arial" w:hAnsi="Arial" w:cs="Arial"/>
+        </w:rPr>
+        <w:t xml:space="preserve">, </w:t>
+      </w:r>
+      <w:r>
+        <w:rPr>
+          <w:rFonts w:ascii="Arial" w:hAnsi="Arial" w:cs="Arial"/>
+        </w:rPr>
+        <w:t>unos 333 al día.</w:t>
+      </w:r>
+    </w:p>
+    <w:p>
+      <w:pPr>
+        <w:rPr>
+          <w:rFonts w:ascii="Arial" w:hAnsi="Arial" w:cs="Arial"/>
+        </w:rPr>
+      </w:pPr>
+      <w:r>
+        <w:rPr>
+          <w:rFonts w:ascii="Arial" w:hAnsi="Arial" w:cs="Arial"/>
+        </w:rPr>
+        <w:t>Histórico a 5 años, sin contar crecimiento: 900 millones de boletos, 360 millones de ventas y 468 millones de pagos.</w:t>
+      </w:r>
+    </w:p>
+    <w:p>
+      <w:pPr>
+        <w:rPr>
+          <w:rFonts w:ascii="Arial" w:hAnsi="Arial" w:cs="Arial"/>
+        </w:rPr>
+      </w:pPr>
+      <w:r>
+        <w:rPr>
+          <w:rFonts w:ascii="Arial" w:hAnsi="Arial" w:cs="Arial"/>
+        </w:rPr>
+        <w:t>Registros de auditoría: 151.4 millones de registros al mes entre las cuatro bitácoras</w:t>
+      </w:r>
+      <w:r>
+        <w:rPr>
+          <w:rFonts w:ascii="Arial" w:hAnsi="Arial" w:cs="Arial"/>
+        </w:rPr>
+        <w:t xml:space="preserve">, </w:t>
+      </w:r>
+      <w:r>
+        <w:rPr>
+          <w:rFonts w:ascii="Arial" w:hAnsi="Arial" w:cs="Arial"/>
+        </w:rPr>
+        <w:t>15.6 millones de transaccion_log, 120 millones de asiento_auditoria_log, 15.75 millones de acceso_puerta_log y 0.075 millones de admin_operacion_audit. Son unos 1,817 millones al año y unos 9,085 millones en 5 años. El espacio que ocupan está en la tabla de almacenamiento de la sección 1.2, con los supuestos que usamos.</w:t>
+      </w:r>
+    </w:p>
+    <w:p>
+      <w:pPr>
+        <w:rPr>
+          <w:rFonts w:ascii="Arial" w:hAnsi="Arial" w:cs="Arial"/>
+        </w:rPr>
+      </w:pPr>
+    </w:p>
+    <w:p>
+      <w:pPr>
+        <w:rPr>
+          <w:rFonts w:ascii="Arial" w:hAnsi="Arial" w:cs="Arial"/>
+        </w:rPr>
+      </w:pPr>
+      <w:r>
+        <w:rPr>
+          <w:rFonts w:ascii="Arial" w:hAnsi="Arial" w:cs="Arial"/>
+        </w:rPr>
+        <w:t>Operación y mantenimiento</w:t>
+      </w:r>
+    </w:p>
+    <w:p>
+      <w:pPr>
+        <w:rPr>
+          <w:rFonts w:ascii="Arial" w:hAnsi="Arial" w:cs="Arial"/>
+        </w:rPr>
+      </w:pPr>
+      <w:r>
+        <w:rPr>
+          <w:rFonts w:ascii="Arial" w:hAnsi="Arial" w:cs="Arial"/>
+        </w:rPr>
+        <w:t>Respaldos. Proponemos un respaldo continuo de los registros de transacciones, para poder restaurar a cualquier momento de los últimos 35 días, una copia completa diaria automática, una copia semanal replicada en otra región y una copia mensual en almacenamiento de archivo que no se pueda modificar, guardada 5 años. Cada trimestre se prueba restaurar una copia para confirmar que sirve.</w:t>
+      </w:r>
+    </w:p>
+    <w:p>
+      <w:pPr>
+        <w:rPr>
+          <w:rFonts w:ascii="Arial" w:hAnsi="Arial" w:cs="Arial"/>
+        </w:rPr>
+      </w:pPr>
+      <w:r>
+        <w:rPr>
+          <w:rFonts w:ascii="Arial" w:hAnsi="Arial" w:cs="Arial"/>
+          <w:lang w:val="pt-PT"/>
+        </w:rPr>
+        <w:t xml:space="preserve">RPO de 5 segundos o menos. </w:t>
+      </w:r>
+      <w:r>
+        <w:rPr>
+          <w:rFonts w:ascii="Arial" w:hAnsi="Arial" w:cs="Arial"/>
+        </w:rPr>
+        <w:t>La base de datos replica de forma sincrónica entre zonas, así que si cae una zona no se pierden datos, y de forma asíncrona hacia otra región. Esto importa porque perder datos significa ventas sin registrar, doble venta y problemas legales.</w:t>
+      </w:r>
+    </w:p>
+    <w:p>
+      <w:pPr>
+        <w:rPr>
+          <w:rFonts w:ascii="Arial" w:hAnsi="Arial" w:cs="Arial"/>
+        </w:rPr>
+      </w:pPr>
+      <w:r>
+        <w:rPr>
+          <w:rFonts w:ascii="Arial" w:hAnsi="Arial" w:cs="Arial"/>
+        </w:rPr>
+        <w:t>RTO menor a 5 minutos. La base de datos y el tráfico cambian automáticamente a la réplica, sin que nadie tenga que intervenir, y las réplicas ya están encendidas en otra zona. Cada minuto caído durante un estreno mundial es una pérdida enorme.</w:t>
+      </w:r>
+    </w:p>
+    <w:p>
+      <w:pPr>
+        <w:rPr>
+          <w:rFonts w:ascii="Arial" w:hAnsi="Arial" w:cs="Arial"/>
+        </w:rPr>
+      </w:pPr>
+      <w:r>
+        <w:rPr>
+          <w:rFonts w:ascii="Arial" w:hAnsi="Arial" w:cs="Arial"/>
+        </w:rPr>
+        <w:t>SLA de 99.99%. Equivale a máximo 52.6 minutos de caída al año, o 4.3 minutos al mes. Lo respaldamos con servicios administrados con alta disponibilidad entre zonas y con redundancia en cada capa. El SLA total es el producto de los SLA de las partes que van en serie</w:t>
+      </w:r>
+      <w:r>
+        <w:rPr>
+          <w:rFonts w:ascii="Arial" w:hAnsi="Arial" w:cs="Arial"/>
+        </w:rPr>
+        <w:t xml:space="preserve">, </w:t>
+      </w:r>
+      <w:r>
+        <w:rPr>
+          <w:rFonts w:ascii="Arial" w:hAnsi="Arial" w:cs="Arial"/>
+        </w:rPr>
+        <w:t>por eso ninguna capa depende de un solo componente.</w:t>
+      </w:r>
+    </w:p>
+    <w:p>
+      <w:pPr>
+        <w:rPr>
+          <w:rFonts w:ascii="Arial" w:hAnsi="Arial" w:cs="Arial"/>
+        </w:rPr>
+      </w:pPr>
+      <w:r>
+        <w:rPr>
+          <w:rFonts w:ascii="Arial" w:hAnsi="Arial" w:cs="Arial"/>
+        </w:rPr>
+        <w:t>Recuperación ante desastres. Usamos un esquema activo-pasivo en dos regiones, con pasos documentados para cada tipo de falla y simulacros de caída de zona y de región dos veces al año.</w:t>
+      </w:r>
+    </w:p>
+    <w:p>
+      <w:pPr>
+        <w:rPr>
+          <w:rFonts w:ascii="Arial" w:hAnsi="Arial" w:cs="Arial"/>
+        </w:rPr>
+      </w:pPr>
+      <w:r>
+        <w:rPr>
+          <w:rFonts w:ascii="Arial" w:hAnsi="Arial" w:cs="Arial"/>
+        </w:rPr>
+        <w:t xml:space="preserve">Privacidad de datos. Guardamos solo los datos personales necesarios, cifrados y con acceso por rol. Hay un cruce entre privacidad y retención: la norma fiscal pide guardar 5 años, pero las leyes de privacidad permiten pedir el borrado de datos personales. Lo </w:t>
+      </w:r>
+      <w:r>
+        <w:rPr>
+          <w:rFonts w:ascii="Arial" w:hAnsi="Arial" w:cs="Arial"/>
+        </w:rPr>
+        <w:lastRenderedPageBreak/>
+        <w:t>resolvemos guardando los registros financieros los 5 años y anonimizando los datos personales que no sean obligatorios.</w:t>
+      </w:r>
+    </w:p>
+    <w:p>
+      <w:pPr>
+        <w:rPr>
+          <w:rFonts w:ascii="Arial" w:hAnsi="Arial" w:cs="Arial"/>
+        </w:rPr>
+      </w:pPr>
     </w:p>
     <w:p/>
     <w:p/>
@@ -5262,8 +5599,6 @@
     <w:p/>
     <w:p/>
     <w:p/>
-    <w:p/>
-    <w:p/>
     <w:p>
       <w:pPr>
         <w:pStyle w:val="Subttulo"/>
@@ -5285,9 +5620,378 @@
           <w:sz w:val="22"/>
           <w:szCs w:val="22"/>
         </w:rPr>
+        <w:t>Referencias:</w:t>
+      </w:r>
+    </w:p>
+    <w:p>
+      <w:r>
+        <w:t xml:space="preserve">Amazon Web Services. (s. f.-a). </w:t>
+      </w:r>
+      <w:r>
+        <w:rPr>
+          <w:i/>
+          <w:iCs/>
+        </w:rPr>
+        <w:t>Amazon Aurora pricing</w:t>
+      </w:r>
+      <w:r>
+        <w:t xml:space="preserve">. Recuperado el 20 de octubre de 2026, de </w:t>
+      </w:r>
+      <w:hyperlink r:id="rId6" w:history="1">
+        <w:r>
+          <w:rPr>
+            <w:rStyle w:val="Hipervnculo"/>
+          </w:rPr>
+          <w:t>https://aws.amazon.com/rds/aurora/pricing</w:t>
+        </w:r>
+      </w:hyperlink>
+    </w:p>
+    <w:p>
+      <w:r>
+        <w:rPr>
+          <w:lang w:val="en-US"/>
+        </w:rPr>
+        <w:t xml:space="preserve">Amazon Web Services. (s. f.-b). </w:t>
+      </w:r>
+      <w:r>
+        <w:rPr>
+          <w:i/>
+          <w:iCs/>
+        </w:rPr>
+        <w:t>AWS WAF pricing</w:t>
+      </w:r>
+      <w:r>
+        <w:t xml:space="preserve">. Recuperado el 20 de octubre de 2026, de </w:t>
+      </w:r>
+      <w:hyperlink r:id="rId7" w:history="1">
+        <w:r>
+          <w:rPr>
+            <w:rStyle w:val="Hipervnculo"/>
+          </w:rPr>
+          <w:t>https://aws.amazon.com/waf/pricing/</w:t>
+        </w:r>
+      </w:hyperlink>
+    </w:p>
+    <w:p>
+      <w:r>
+        <w:t xml:space="preserve">Bytebase. (s. f.). </w:t>
+      </w:r>
+      <w:r>
+        <w:rPr>
+          <w:i/>
+          <w:iCs/>
+        </w:rPr>
+        <w:t>Azure Database for PostgreSQL &amp; MySQL pricing</w:t>
+      </w:r>
+      <w:r>
+        <w:t xml:space="preserve">. Recuperado el 20 de octubre de 2026, de </w:t>
+      </w:r>
+      <w:hyperlink r:id="rId8" w:history="1">
+        <w:r>
+          <w:rPr>
+            <w:rStyle w:val="Hipervnculo"/>
+          </w:rPr>
+          <w:t>https://www.bytebase.com/dbcost/azure-flexible-server-pricing/</w:t>
+        </w:r>
+      </w:hyperlink>
+    </w:p>
+    <w:p>
+      <w:r>
+        <w:rPr>
+          <w:lang w:val="en-US"/>
+        </w:rPr>
+        <w:t xml:space="preserve">Cloudian. (s. f.). </w:t>
+      </w:r>
+      <w:r>
+        <w:rPr>
+          <w:i/>
+          <w:iCs/>
+          <w:lang w:val="en-US"/>
+        </w:rPr>
+        <w:t>Understanding AWS S3 storage pricing: A comprehensive guide</w:t>
+      </w:r>
+      <w:r>
+        <w:rPr>
+          <w:lang w:val="en-US"/>
+        </w:rPr>
+        <w:t xml:space="preserve">. </w:t>
+      </w:r>
+      <w:r>
+        <w:t xml:space="preserve">Recuperado el 20 de octubre de 2026, de </w:t>
+      </w:r>
+      <w:hyperlink r:id="rId9" w:history="1">
+        <w:r>
+          <w:rPr>
+            <w:rStyle w:val="Hipervnculo"/>
+          </w:rPr>
+          <w:t>https://cloudian.com/blog/5-components-of-aws-s3-storage-pricing.md</w:t>
+        </w:r>
+      </w:hyperlink>
+    </w:p>
+    <w:p>
+      <w:pPr>
+        <w:rPr>
+          <w:lang w:val="pt-PT"/>
+        </w:rPr>
+      </w:pPr>
+      <w:r>
+        <w:rPr>
+          <w:lang w:val="pt-PT"/>
+        </w:rPr>
+        <w:t xml:space="preserve">CloudZero. (2026, 22 de julio). </w:t>
+      </w:r>
+      <w:r>
+        <w:rPr>
+          <w:i/>
+          <w:iCs/>
+          <w:lang w:val="pt-PT"/>
+        </w:rPr>
+        <w:t>Azure Blob Storage pricing</w:t>
+      </w:r>
+      <w:r>
+        <w:rPr>
+          <w:lang w:val="pt-PT"/>
+        </w:rPr>
+        <w:t xml:space="preserve">. </w:t>
+      </w:r>
+      <w:hyperlink r:id="rId10" w:history="1">
+        <w:r>
+          <w:rPr>
+            <w:rStyle w:val="Hipervnculo"/>
+            <w:lang w:val="pt-PT"/>
+          </w:rPr>
+          <w:t>https://cloudzero.com/blog/azure-blob-storage-pricing</w:t>
+        </w:r>
+      </w:hyperlink>
+    </w:p>
+    <w:p>
+      <w:r>
+        <w:rPr>
+          <w:lang w:val="pt-PT"/>
+        </w:rPr>
+        <w:t xml:space="preserve">Google. (s. f.-a). </w:t>
+      </w:r>
+      <w:r>
+        <w:rPr>
+          <w:i/>
+          <w:iCs/>
+          <w:lang w:val="en-US"/>
+        </w:rPr>
+        <w:t>Files you can store in Google Drive</w:t>
+      </w:r>
+      <w:r>
+        <w:rPr>
+          <w:lang w:val="en-US"/>
+        </w:rPr>
+        <w:t xml:space="preserve">. </w:t>
+      </w:r>
+      <w:r>
+        <w:t xml:space="preserve">Ayuda de Google Drive. Recuperado el 20 de octubre de 2026, de </w:t>
+      </w:r>
+      <w:hyperlink r:id="rId11" w:history="1">
+        <w:r>
+          <w:rPr>
+            <w:rStyle w:val="Hipervnculo"/>
+          </w:rPr>
+          <w:t>https://support.google.com/drive/answer/37603</w:t>
+        </w:r>
+      </w:hyperlink>
+    </w:p>
+    <w:p>
+      <w:r>
+        <w:rPr>
+          <w:lang w:val="en-US"/>
+        </w:rPr>
+        <w:t xml:space="preserve">Google. (s. f.-b). </w:t>
+      </w:r>
+      <w:r>
+        <w:rPr>
+          <w:i/>
+          <w:iCs/>
+          <w:lang w:val="en-US"/>
+        </w:rPr>
+        <w:t>Usage limits</w:t>
+      </w:r>
+      <w:r>
+        <w:rPr>
+          <w:lang w:val="en-US"/>
+        </w:rPr>
+        <w:t xml:space="preserve">. </w:t>
+      </w:r>
+      <w:r>
+        <w:t xml:space="preserve">Google for Developers. Recuperado el 20 de octubre de 2026, de </w:t>
+      </w:r>
+      <w:hyperlink r:id="rId12" w:history="1">
+        <w:r>
+          <w:rPr>
+            <w:rStyle w:val="Hipervnculo"/>
+          </w:rPr>
+          <w:t>https://developers.google.com/sheets/api/limits</w:t>
+        </w:r>
+      </w:hyperlink>
+    </w:p>
+    <w:p>
+      <w:pPr>
+        <w:rPr>
+          <w:lang w:val="en-US"/>
+        </w:rPr>
+      </w:pPr>
+      <w:r>
+        <w:t xml:space="preserve">Google Workspace Updates. (2026, 10 de septiembre). </w:t>
+      </w:r>
+      <w:r>
+        <w:rPr>
+          <w:i/>
+          <w:iCs/>
+          <w:lang w:val="en-US"/>
+        </w:rPr>
+        <w:t>Doubled cell limits in Google Sheets now generally available</w:t>
+      </w:r>
+      <w:r>
+        <w:rPr>
+          <w:lang w:val="en-US"/>
+        </w:rPr>
+        <w:t xml:space="preserve">. Workspace Updates Blog. </w:t>
+      </w:r>
+      <w:hyperlink r:id="rId13" w:history="1">
+        <w:r>
+          <w:rPr>
+            <w:rStyle w:val="Hipervnculo"/>
+            <w:lang w:val="en-US"/>
+          </w:rPr>
+          <w:t>https://workspaceupdates.googleblog.com/2026/09/doubled-cell-limits-in-google-sheets-now-generally-available.html</w:t>
+        </w:r>
+      </w:hyperlink>
+    </w:p>
+    <w:p>
+      <w:pPr>
+        <w:rPr>
+          <w:lang w:val="en-US"/>
+        </w:rPr>
+      </w:pPr>
+      <w:r>
+        <w:t xml:space="preserve">Gray, L. K. (2017, 2 de noviembre). </w:t>
+      </w:r>
+      <w:r>
+        <w:rPr>
+          <w:i/>
+          <w:iCs/>
+          <w:lang w:val="en-US"/>
+        </w:rPr>
+        <w:t>FAQ: Can CVC be stored for card on file or recurring transactions?</w:t>
+      </w:r>
+      <w:r>
+        <w:rPr>
+          <w:lang w:val="en-US"/>
+        </w:rPr>
+        <w:t xml:space="preserve"> PCI Security Standards Council Blog. </w:t>
+      </w:r>
+      <w:hyperlink r:id="rId14" w:history="1">
+        <w:r>
+          <w:rPr>
+            <w:rStyle w:val="Hipervnculo"/>
+            <w:lang w:val="en-US"/>
+          </w:rPr>
+          <w:t>https://blog.pcisecuritystandards.org/faq-can-cvc-be-stored-for-card-on-file-or-recurring-transactions</w:t>
+        </w:r>
+      </w:hyperlink>
+    </w:p>
+    <w:p>
+      <w:r>
+        <w:rPr>
+          <w:lang w:val="en-US"/>
+        </w:rPr>
         <w:lastRenderedPageBreak/>
-        <w:t>Referencias:</w:t>
-      </w:r>
+        <w:t xml:space="preserve">Microsoft. (s. f.). </w:t>
+      </w:r>
+      <w:r>
+        <w:rPr>
+          <w:i/>
+          <w:iCs/>
+          <w:lang w:val="en-US"/>
+        </w:rPr>
+        <w:t>Azure Front Door pricing</w:t>
+      </w:r>
+      <w:r>
+        <w:rPr>
+          <w:lang w:val="en-US"/>
+        </w:rPr>
+        <w:t xml:space="preserve">. </w:t>
+      </w:r>
+      <w:r>
+        <w:t xml:space="preserve">Azure. Recuperado el 20 de octubre de 2026, de </w:t>
+      </w:r>
+      <w:hyperlink r:id="rId15" w:history="1">
+        <w:r>
+          <w:rPr>
+            <w:rStyle w:val="Hipervnculo"/>
+          </w:rPr>
+          <w:t>https://azure.microsoft.com/en-us/pricing/details/frontdoor/</w:t>
+        </w:r>
+      </w:hyperlink>
+    </w:p>
+    <w:p>
+      <w:r>
+        <w:rPr>
+          <w:lang w:val="pt-PT"/>
+        </w:rPr>
+        <w:t xml:space="preserve">Microsoft. (2026). </w:t>
+      </w:r>
+      <w:r>
+        <w:rPr>
+          <w:i/>
+          <w:iCs/>
+          <w:lang w:val="pt-PT"/>
+        </w:rPr>
+        <w:t>Access specifications</w:t>
+      </w:r>
+      <w:r>
+        <w:rPr>
+          <w:lang w:val="pt-PT"/>
+        </w:rPr>
+        <w:t xml:space="preserve">. Soporte técnico de Microsoft. </w:t>
+      </w:r>
+      <w:r>
+        <w:t xml:space="preserve">Recuperado el 20 de octubre de 2026, de </w:t>
+      </w:r>
+      <w:hyperlink r:id="rId16" w:history="1">
+        <w:r>
+          <w:rPr>
+            <w:rStyle w:val="Hipervnculo"/>
+          </w:rPr>
+          <w:t>https://support.microsoft.com/en-us/access/access-specifications</w:t>
+        </w:r>
+      </w:hyperlink>
+    </w:p>
+    <w:p>
+      <w:r>
+        <w:rPr>
+          <w:lang w:val="en-US"/>
+        </w:rPr>
+        <w:t xml:space="preserve">SQLite. (2025, 31 de mayo). </w:t>
+      </w:r>
+      <w:r>
+        <w:rPr>
+          <w:i/>
+          <w:iCs/>
+          <w:lang w:val="en-US"/>
+        </w:rPr>
+        <w:t>Appropriate uses for SQLite</w:t>
+      </w:r>
+      <w:r>
+        <w:rPr>
+          <w:lang w:val="en-US"/>
+        </w:rPr>
+        <w:t xml:space="preserve">. </w:t>
+      </w:r>
+      <w:hyperlink r:id="rId17" w:history="1">
+        <w:r>
+          <w:rPr>
+            <w:rStyle w:val="Hipervnculo"/>
+          </w:rPr>
+          <w:t>https://www.sqlite.org/whentouse.html</w:t>
+        </w:r>
+      </w:hyperlink>
     </w:p>
     <w:p/>
     <w:p/>
@@ -6486,6 +7190,29 @@
       </w:tblBorders>
     </w:tblPr>
   </w:style>
+  <w:style w:type="character" w:styleId="Hipervnculo">
+    <w:name w:val="Hyperlink"/>
+    <w:basedOn w:val="Fuentedeprrafopredeter"/>
+    <w:uiPriority w:val="99"/>
+    <w:unhideWhenUsed/>
+    <w:rsid w:val="00416F64"/>
+    <w:rPr>
+      <w:color w:val="467886" w:themeColor="hyperlink"/>
+      <w:u w:val="single"/>
+    </w:rPr>
+  </w:style>
+  <w:style w:type="character" w:styleId="Mencinsinresolver">
+    <w:name w:val="Unresolved Mention"/>
+    <w:basedOn w:val="Fuentedeprrafopredeter"/>
+    <w:uiPriority w:val="99"/>
+    <w:semiHidden/>
+    <w:unhideWhenUsed/>
+    <w:rsid w:val="00416F64"/>
+    <w:rPr>
+      <w:color w:val="605E5C"/>
+      <w:shd w:val="clear" w:color="auto" w:fill="E1DFDD"/>
+    </w:rPr>
+  </w:style>
 </w:styles>
 </file>
 

</xml_diff>

<commit_message>
vistas, roles y consultas añadidos al sql
</commit_message>
<xml_diff>
--- a/Documentación/Documetación II Proyecto BD.docx
+++ b/Documentación/Documetación II Proyecto BD.docx
@@ -374,7 +374,21 @@
     <w:p>
       <w:r>
         <w:tab/>
-        <w:t>Tras hacer la evaluación de la infraestructura propuesta por el proveedor saliente contra la carga esperada del estreno mundial, esta siendo de 8 millones de usuarios concurrentes, con un pico de 50.000 TPS durante 10min, involucrando transacciones ACID, tener que cumplir PCI-DSS y con retención de auditoria de 5 años, el equipo la rechaza. Ninguno de los 6 componentes cumple con los requisitos mínimos del negocio y varios violan directamente las reglas de negocio y normas de pago. A continuación las discrepancias.</w:t>
+        <w:t xml:space="preserve">Tras hacer la evaluación de la infraestructura propuesta por el proveedor saliente contra la carga esperada del estreno mundial, </w:t>
+      </w:r>
+      <w:proofErr w:type="spellStart"/>
+      <w:r>
+        <w:t>esta</w:t>
+      </w:r>
+      <w:proofErr w:type="spellEnd"/>
+      <w:r>
+        <w:t xml:space="preserve"> siendo de 8 millones de usuarios concurrentes, con un pico de 50.000 TPS durante 10min, involucrando transacciones ACID, tener que cumplir PCI-DSS y con retención de auditoria de 5 años, el equipo la rechaza. Ninguno de los 6 componentes cumple con los requisitos mínimos del negocio y varios violan directamente las reglas de negocio y normas de pago. A </w:t>
+      </w:r>
+      <w:r>
+        <w:t>continuación,</w:t>
+      </w:r>
+      <w:r>
+        <w:t xml:space="preserve"> las discrepancias.</w:t>
       </w:r>
     </w:p>
     <w:p>
@@ -441,7 +455,23 @@
         <w:t xml:space="preserve">, es decir </w:t>
       </w:r>
       <w:r>
-        <w:t>800 Mbps, 16 veces la capacidad del enlace, y eso sin contar el Wi-Fi compartido. Un enlace residencial no tiene SLA, ni redundancia, ni protección contra ataques DDoS, ni latencia razonable para cines en otros continentes.</w:t>
+        <w:t xml:space="preserve">800 Mbps, 16 veces la capacidad del enlace, y eso sin contar el </w:t>
+      </w:r>
+      <w:proofErr w:type="spellStart"/>
+      <w:r>
+        <w:t>Wi</w:t>
+      </w:r>
+      <w:proofErr w:type="spellEnd"/>
+      <w:r>
+        <w:t xml:space="preserve">-Fi compartido. Un enlace residencial no tiene SLA, ni redundancia, ni protección contra ataques </w:t>
+      </w:r>
+      <w:proofErr w:type="spellStart"/>
+      <w:r>
+        <w:t>DDoS</w:t>
+      </w:r>
+      <w:proofErr w:type="spellEnd"/>
+      <w:r>
+        <w:t>, ni latencia razonable para cines en otros continentes.</w:t>
       </w:r>
     </w:p>
     <w:p>
@@ -488,11 +518,16 @@
         <w:t>enviarlos en claro a un chat grupal los expone a cualquiera con acceso al grupo. Incumple la RN-09, y el cobro manual por un pasante rompe la atomicidad entre pago y asiento (RN-10 y RN-11). La exposición es legal</w:t>
       </w:r>
       <w:r>
-        <w:t xml:space="preserve"> como multas o demandas </w:t>
-      </w:r>
-      <w:r>
-        <w:t xml:space="preserve"> y</w:t>
-      </w:r>
+        <w:t xml:space="preserve"> como multas o </w:t>
+      </w:r>
+      <w:r>
+        <w:t xml:space="preserve">demandas </w:t>
+      </w:r>
+      <w:proofErr w:type="gramStart"/>
+      <w:r>
+        <w:t>y</w:t>
+      </w:r>
+      <w:proofErr w:type="gramEnd"/>
       <w:r>
         <w:t xml:space="preserve"> además, </w:t>
       </w:r>
@@ -517,13 +552,27 @@
         <w:t xml:space="preserve">. </w:t>
       </w:r>
       <w:r>
-        <w:t>No existe plan. Sin backups ni réplica, el RPO es toda la información desde la última copia</w:t>
-      </w:r>
-      <w:r>
-        <w:t xml:space="preserve"> que no existe </w:t>
-      </w:r>
-      <w:r>
-        <w:t xml:space="preserve"> y el RTO es indefinido. Esto contradice el objetivo de disponibilidad</w:t>
+        <w:t xml:space="preserve">No existe plan. Sin </w:t>
+      </w:r>
+      <w:proofErr w:type="spellStart"/>
+      <w:r>
+        <w:t>backups</w:t>
+      </w:r>
+      <w:proofErr w:type="spellEnd"/>
+      <w:r>
+        <w:t xml:space="preserve"> ni réplica, el RPO es toda la información desde la última copia</w:t>
+      </w:r>
+      <w:r>
+        <w:t xml:space="preserve"> que no </w:t>
+      </w:r>
+      <w:r>
+        <w:t xml:space="preserve">existe </w:t>
+      </w:r>
+      <w:r>
+        <w:t>y</w:t>
+      </w:r>
+      <w:r>
+        <w:t xml:space="preserve"> el RTO es indefinido. Esto contradice el objetivo de disponibilidad</w:t>
       </w:r>
       <w:r>
         <w:t xml:space="preserve">, que es de </w:t>
@@ -648,7 +697,21 @@
         <w:rPr>
           <w:rFonts w:ascii="Arial" w:hAnsi="Arial" w:cs="Arial"/>
         </w:rPr>
-        <w:t>La infraestructura legada no aguanta un estreno mundial, como explicamos en el dictamen. Proponemos una arquitectura en la nube con estas partes. En la entrada va una CDN con WAF y protección contra DDoS, más una sala de espera virtual para que los 8 millones de usuarios no lleguen todos al mismo tiempo a la base de datos. La aplicación corre en contenedores que escalan solos según la demanda, con una caché para el mapa de asientos. La base de datos es PostgreSQL administrado, con alta disponibilidad entre zonas y una réplica en otra región. Los pagos pasan por una pasarela externa certificada (en este proyecto se simula). El histórico de 5 años se guarda en almacenamiento de archivo, y lo reciente en almacenamiento rápido.</w:t>
+        <w:t xml:space="preserve">La infraestructura legada no aguanta un estreno mundial, como explicamos en el dictamen. Proponemos una arquitectura en la nube con estas partes. En la entrada va una CDN con WAF y protección contra </w:t>
+      </w:r>
+      <w:proofErr w:type="spellStart"/>
+      <w:r>
+        <w:rPr>
+          <w:rFonts w:ascii="Arial" w:hAnsi="Arial" w:cs="Arial"/>
+        </w:rPr>
+        <w:t>DDoS</w:t>
+      </w:r>
+      <w:proofErr w:type="spellEnd"/>
+      <w:r>
+        <w:rPr>
+          <w:rFonts w:ascii="Arial" w:hAnsi="Arial" w:cs="Arial"/>
+        </w:rPr>
+        <w:t>, más una sala de espera virtual para que los 8 millones de usuarios no lleguen todos al mismo tiempo a la base de datos. La aplicación corre en contenedores que escalan solos según la demanda, con una caché para el mapa de asientos. La base de datos es PostgreSQL administrado, con alta disponibilidad entre zonas y una réplica en otra región. Los pagos pasan por una pasarela externa certificada (en este proyecto se simula). El histórico de 5 años se guarda en almacenamiento de archivo, y lo reciente en almacenamiento rápido.</w:t>
       </w:r>
     </w:p>
     <w:p>
@@ -882,12 +945,14 @@
                 <w:rFonts w:ascii="Arial" w:hAnsi="Arial" w:cs="Arial"/>
               </w:rPr>
             </w:pPr>
+            <w:proofErr w:type="spellStart"/>
             <w:r>
               <w:rPr>
                 <w:rFonts w:ascii="Arial" w:hAnsi="Arial" w:cs="Arial"/>
               </w:rPr>
               <w:t>transaccion_log</w:t>
             </w:r>
+            <w:proofErr w:type="spellEnd"/>
           </w:p>
         </w:tc>
         <w:tc>
@@ -964,12 +1029,14 @@
                 <w:rFonts w:ascii="Arial" w:hAnsi="Arial" w:cs="Arial"/>
               </w:rPr>
             </w:pPr>
+            <w:proofErr w:type="spellStart"/>
             <w:r>
               <w:rPr>
                 <w:rFonts w:ascii="Arial" w:hAnsi="Arial" w:cs="Arial"/>
               </w:rPr>
               <w:t>asiento_auditoria_log</w:t>
             </w:r>
+            <w:proofErr w:type="spellEnd"/>
           </w:p>
         </w:tc>
         <w:tc>
@@ -1046,12 +1113,14 @@
                 <w:rFonts w:ascii="Arial" w:hAnsi="Arial" w:cs="Arial"/>
               </w:rPr>
             </w:pPr>
+            <w:proofErr w:type="spellStart"/>
             <w:r>
               <w:rPr>
                 <w:rFonts w:ascii="Arial" w:hAnsi="Arial" w:cs="Arial"/>
               </w:rPr>
               <w:t>acceso_puerta_log</w:t>
             </w:r>
+            <w:proofErr w:type="spellEnd"/>
           </w:p>
         </w:tc>
         <w:tc>
@@ -1128,12 +1197,14 @@
                 <w:rFonts w:ascii="Arial" w:hAnsi="Arial" w:cs="Arial"/>
               </w:rPr>
             </w:pPr>
+            <w:proofErr w:type="spellStart"/>
             <w:r>
               <w:rPr>
                 <w:rFonts w:ascii="Arial" w:hAnsi="Arial" w:cs="Arial"/>
               </w:rPr>
               <w:t>admin_operacion_audit</w:t>
             </w:r>
+            <w:proofErr w:type="spellEnd"/>
           </w:p>
         </w:tc>
         <w:tc>
@@ -1456,11 +1527,19 @@
                 <w:rFonts w:ascii="Arial" w:hAnsi="Arial" w:cs="Arial"/>
               </w:rPr>
             </w:pPr>
-            <w:r>
-              <w:rPr>
-                <w:rFonts w:ascii="Arial" w:hAnsi="Arial" w:cs="Arial"/>
-              </w:rPr>
-              <w:t>Total mensual</w:t>
+            <w:proofErr w:type="gramStart"/>
+            <w:r>
+              <w:rPr>
+                <w:rFonts w:ascii="Arial" w:hAnsi="Arial" w:cs="Arial"/>
+              </w:rPr>
+              <w:t>Total</w:t>
+            </w:r>
+            <w:proofErr w:type="gramEnd"/>
+            <w:r>
+              <w:rPr>
+                <w:rFonts w:ascii="Arial" w:hAnsi="Arial" w:cs="Arial"/>
+              </w:rPr>
+              <w:t xml:space="preserve"> mensual</w:t>
             </w:r>
           </w:p>
         </w:tc>
@@ -1606,7 +1685,35 @@
         <w:rPr>
           <w:rFonts w:ascii="Arial" w:hAnsi="Arial" w:cs="Arial"/>
         </w:rPr>
-        <w:t>Acumulado a 5 años: sin crecimiento son 3.6 TB  y 8.9 TB . Con un crecimiento de 10% anual son 4.4 TB y 10.9 TB. Si en el conservador contamos 3 copias</w:t>
+        <w:t xml:space="preserve">Acumulado a 5 años: sin crecimiento son 3.6 </w:t>
+      </w:r>
+      <w:proofErr w:type="gramStart"/>
+      <w:r>
+        <w:rPr>
+          <w:rFonts w:ascii="Arial" w:hAnsi="Arial" w:cs="Arial"/>
+        </w:rPr>
+        <w:t>TB  y</w:t>
+      </w:r>
+      <w:proofErr w:type="gramEnd"/>
+      <w:r>
+        <w:rPr>
+          <w:rFonts w:ascii="Arial" w:hAnsi="Arial" w:cs="Arial"/>
+        </w:rPr>
+        <w:t xml:space="preserve"> 8.9 </w:t>
+      </w:r>
+      <w:proofErr w:type="gramStart"/>
+      <w:r>
+        <w:rPr>
+          <w:rFonts w:ascii="Arial" w:hAnsi="Arial" w:cs="Arial"/>
+        </w:rPr>
+        <w:t>TB .</w:t>
+      </w:r>
+      <w:proofErr w:type="gramEnd"/>
+      <w:r>
+        <w:rPr>
+          <w:rFonts w:ascii="Arial" w:hAnsi="Arial" w:cs="Arial"/>
+        </w:rPr>
+        <w:t xml:space="preserve"> Con un crecimiento de 10% anual son 4.4 TB y 10.9 TB. Si en el conservador contamos 3 copias</w:t>
       </w:r>
       <w:r>
         <w:rPr>
@@ -1750,27 +1857,69 @@
               <w:rPr>
                 <w:rFonts w:ascii="Arial" w:hAnsi="Arial" w:cs="Arial"/>
               </w:rPr>
-              <w:t>Aurora PostgreSQL multirregión con autoescalado: 12,500 USD</w:t>
-            </w:r>
-          </w:p>
-        </w:tc>
-        <w:tc>
-          <w:tcPr>
-            <w:tcW w:w="0" w:type="auto"/>
-            <w:hideMark/>
-          </w:tcPr>
-          <w:p>
-            <w:pPr>
-              <w:spacing w:after="160" w:line="259" w:lineRule="auto"/>
-              <w:rPr>
-                <w:rFonts w:ascii="Arial" w:hAnsi="Arial" w:cs="Arial"/>
-              </w:rPr>
-            </w:pPr>
-            <w:r>
-              <w:rPr>
-                <w:rFonts w:ascii="Arial" w:hAnsi="Arial" w:cs="Arial"/>
-              </w:rPr>
-              <w:t>Azure Database for PostgreSQL Flexible Server con alta disponibilidad: 11,800 USD</w:t>
+              <w:t xml:space="preserve">Aurora PostgreSQL multirregión con </w:t>
+            </w:r>
+            <w:proofErr w:type="spellStart"/>
+            <w:r>
+              <w:rPr>
+                <w:rFonts w:ascii="Arial" w:hAnsi="Arial" w:cs="Arial"/>
+              </w:rPr>
+              <w:t>autoescalado</w:t>
+            </w:r>
+            <w:proofErr w:type="spellEnd"/>
+            <w:r>
+              <w:rPr>
+                <w:rFonts w:ascii="Arial" w:hAnsi="Arial" w:cs="Arial"/>
+              </w:rPr>
+              <w:t>: 12,500 USD</w:t>
+            </w:r>
+          </w:p>
+        </w:tc>
+        <w:tc>
+          <w:tcPr>
+            <w:tcW w:w="0" w:type="auto"/>
+            <w:hideMark/>
+          </w:tcPr>
+          <w:p>
+            <w:pPr>
+              <w:spacing w:after="160" w:line="259" w:lineRule="auto"/>
+              <w:rPr>
+                <w:rFonts w:ascii="Arial" w:hAnsi="Arial" w:cs="Arial"/>
+              </w:rPr>
+            </w:pPr>
+            <w:r>
+              <w:rPr>
+                <w:rFonts w:ascii="Arial" w:hAnsi="Arial" w:cs="Arial"/>
+              </w:rPr>
+              <w:t xml:space="preserve">Azure </w:t>
+            </w:r>
+            <w:proofErr w:type="spellStart"/>
+            <w:r>
+              <w:rPr>
+                <w:rFonts w:ascii="Arial" w:hAnsi="Arial" w:cs="Arial"/>
+              </w:rPr>
+              <w:t>Database</w:t>
+            </w:r>
+            <w:proofErr w:type="spellEnd"/>
+            <w:r>
+              <w:rPr>
+                <w:rFonts w:ascii="Arial" w:hAnsi="Arial" w:cs="Arial"/>
+              </w:rPr>
+              <w:t xml:space="preserve"> </w:t>
+            </w:r>
+            <w:proofErr w:type="spellStart"/>
+            <w:r>
+              <w:rPr>
+                <w:rFonts w:ascii="Arial" w:hAnsi="Arial" w:cs="Arial"/>
+              </w:rPr>
+              <w:t>for</w:t>
+            </w:r>
+            <w:proofErr w:type="spellEnd"/>
+            <w:r>
+              <w:rPr>
+                <w:rFonts w:ascii="Arial" w:hAnsi="Arial" w:cs="Arial"/>
+              </w:rPr>
+              <w:t xml:space="preserve"> PostgreSQL Flexible Server con alta disponibilidad: 11,800 USD</w:t>
             </w:r>
           </w:p>
         </w:tc>
@@ -1792,27 +1941,49 @@
               <w:rPr>
                 <w:rFonts w:ascii="Arial" w:hAnsi="Arial" w:cs="Arial"/>
               </w:rPr>
-              <w:t>Cómputo / frontend</w:t>
-            </w:r>
-          </w:p>
-        </w:tc>
-        <w:tc>
-          <w:tcPr>
-            <w:tcW w:w="0" w:type="auto"/>
-            <w:hideMark/>
-          </w:tcPr>
-          <w:p>
-            <w:pPr>
-              <w:spacing w:after="160" w:line="259" w:lineRule="auto"/>
-              <w:rPr>
-                <w:rFonts w:ascii="Arial" w:hAnsi="Arial" w:cs="Arial"/>
-              </w:rPr>
-            </w:pPr>
-            <w:r>
-              <w:rPr>
-                <w:rFonts w:ascii="Arial" w:hAnsi="Arial" w:cs="Arial"/>
-              </w:rPr>
-              <w:t>EKS, 50 pods en pico: 6,200 USD</w:t>
+              <w:t xml:space="preserve">Cómputo / </w:t>
+            </w:r>
+            <w:proofErr w:type="spellStart"/>
+            <w:r>
+              <w:rPr>
+                <w:rFonts w:ascii="Arial" w:hAnsi="Arial" w:cs="Arial"/>
+              </w:rPr>
+              <w:t>frontend</w:t>
+            </w:r>
+            <w:proofErr w:type="spellEnd"/>
+          </w:p>
+        </w:tc>
+        <w:tc>
+          <w:tcPr>
+            <w:tcW w:w="0" w:type="auto"/>
+            <w:hideMark/>
+          </w:tcPr>
+          <w:p>
+            <w:pPr>
+              <w:spacing w:after="160" w:line="259" w:lineRule="auto"/>
+              <w:rPr>
+                <w:rFonts w:ascii="Arial" w:hAnsi="Arial" w:cs="Arial"/>
+              </w:rPr>
+            </w:pPr>
+            <w:r>
+              <w:rPr>
+                <w:rFonts w:ascii="Arial" w:hAnsi="Arial" w:cs="Arial"/>
+              </w:rPr>
+              <w:t xml:space="preserve">EKS, 50 </w:t>
+            </w:r>
+            <w:proofErr w:type="spellStart"/>
+            <w:r>
+              <w:rPr>
+                <w:rFonts w:ascii="Arial" w:hAnsi="Arial" w:cs="Arial"/>
+              </w:rPr>
+              <w:t>pods</w:t>
+            </w:r>
+            <w:proofErr w:type="spellEnd"/>
+            <w:r>
+              <w:rPr>
+                <w:rFonts w:ascii="Arial" w:hAnsi="Arial" w:cs="Arial"/>
+              </w:rPr>
+              <w:t xml:space="preserve"> en pico: 6,200 USD</w:t>
             </w:r>
           </w:p>
         </w:tc>
@@ -1868,11 +2039,13 @@
               <w:spacing w:after="160" w:line="259" w:lineRule="auto"/>
               <w:rPr>
                 <w:rFonts w:ascii="Arial" w:hAnsi="Arial" w:cs="Arial"/>
-              </w:rPr>
-            </w:pPr>
-            <w:r>
-              <w:rPr>
-                <w:rFonts w:ascii="Arial" w:hAnsi="Arial" w:cs="Arial"/>
+                <w:lang w:val="en-US"/>
+              </w:rPr>
+            </w:pPr>
+            <w:r>
+              <w:rPr>
+                <w:rFonts w:ascii="Arial" w:hAnsi="Arial" w:cs="Arial"/>
+                <w:lang w:val="en-US"/>
               </w:rPr>
               <w:t>S3 Standard + S3 Glacier Flexible Archive: 1,800 USD</w:t>
             </w:r>
@@ -1888,11 +2061,13 @@
               <w:spacing w:after="160" w:line="259" w:lineRule="auto"/>
               <w:rPr>
                 <w:rFonts w:ascii="Arial" w:hAnsi="Arial" w:cs="Arial"/>
-              </w:rPr>
-            </w:pPr>
-            <w:r>
-              <w:rPr>
-                <w:rFonts w:ascii="Arial" w:hAnsi="Arial" w:cs="Arial"/>
+                <w:lang w:val="en-US"/>
+              </w:rPr>
+            </w:pPr>
+            <w:r>
+              <w:rPr>
+                <w:rFonts w:ascii="Arial" w:hAnsi="Arial" w:cs="Arial"/>
+                <w:lang w:val="en-US"/>
               </w:rPr>
               <w:t>Blob Storage + Archive Tier: 1,750 USD</w:t>
             </w:r>
@@ -1932,11 +2107,19 @@
                 <w:rFonts w:ascii="Arial" w:hAnsi="Arial" w:cs="Arial"/>
               </w:rPr>
             </w:pPr>
-            <w:r>
-              <w:rPr>
-                <w:rFonts w:ascii="Arial" w:hAnsi="Arial" w:cs="Arial"/>
-              </w:rPr>
-              <w:t>CloudFront + WAF + Global Accelerator: 3,500 USD</w:t>
+            <w:proofErr w:type="spellStart"/>
+            <w:r>
+              <w:rPr>
+                <w:rFonts w:ascii="Arial" w:hAnsi="Arial" w:cs="Arial"/>
+              </w:rPr>
+              <w:t>CloudFront</w:t>
+            </w:r>
+            <w:proofErr w:type="spellEnd"/>
+            <w:r>
+              <w:rPr>
+                <w:rFonts w:ascii="Arial" w:hAnsi="Arial" w:cs="Arial"/>
+              </w:rPr>
+              <w:t xml:space="preserve"> + WAF + Global Accelerator: 3,500 USD</w:t>
             </w:r>
           </w:p>
         </w:tc>
@@ -1974,11 +2157,19 @@
                 <w:rFonts w:ascii="Arial" w:hAnsi="Arial" w:cs="Arial"/>
               </w:rPr>
             </w:pPr>
-            <w:r>
-              <w:rPr>
-                <w:rFonts w:ascii="Arial" w:hAnsi="Arial" w:cs="Arial"/>
-              </w:rPr>
-              <w:t>Total mensual (OPEX)</w:t>
+            <w:proofErr w:type="gramStart"/>
+            <w:r>
+              <w:rPr>
+                <w:rFonts w:ascii="Arial" w:hAnsi="Arial" w:cs="Arial"/>
+              </w:rPr>
+              <w:t>Total</w:t>
+            </w:r>
+            <w:proofErr w:type="gramEnd"/>
+            <w:r>
+              <w:rPr>
+                <w:rFonts w:ascii="Arial" w:hAnsi="Arial" w:cs="Arial"/>
+              </w:rPr>
+              <w:t xml:space="preserve"> mensual (OPEX)</w:t>
             </w:r>
           </w:p>
         </w:tc>
@@ -2196,11 +2387,13 @@
               <w:spacing w:after="160" w:line="259" w:lineRule="auto"/>
               <w:rPr>
                 <w:rFonts w:ascii="Arial" w:hAnsi="Arial" w:cs="Arial"/>
-              </w:rPr>
-            </w:pPr>
-            <w:r>
-              <w:rPr>
-                <w:rFonts w:ascii="Arial" w:hAnsi="Arial" w:cs="Arial"/>
+                <w:lang w:val="en-US"/>
+              </w:rPr>
+            </w:pPr>
+            <w:r>
+              <w:rPr>
+                <w:rFonts w:ascii="Arial" w:hAnsi="Arial" w:cs="Arial"/>
+                <w:lang w:val="en-US"/>
               </w:rPr>
               <w:t>Amazon Web Services (s. f.-a)</w:t>
             </w:r>
@@ -2218,11 +2411,13 @@
               <w:spacing w:after="160" w:line="259" w:lineRule="auto"/>
               <w:rPr>
                 <w:rFonts w:ascii="Arial" w:hAnsi="Arial" w:cs="Arial"/>
-              </w:rPr>
-            </w:pPr>
-            <w:r>
-              <w:rPr>
-                <w:rFonts w:ascii="Arial" w:hAnsi="Arial" w:cs="Arial"/>
+                <w:lang w:val="pt-PT"/>
+              </w:rPr>
+            </w:pPr>
+            <w:r>
+              <w:rPr>
+                <w:rFonts w:ascii="Arial" w:hAnsi="Arial" w:cs="Arial"/>
+                <w:lang w:val="pt-PT"/>
               </w:rPr>
               <w:t>Aurora, operaciones de I/O</w:t>
             </w:r>
@@ -2258,11 +2453,13 @@
               <w:spacing w:after="160" w:line="259" w:lineRule="auto"/>
               <w:rPr>
                 <w:rFonts w:ascii="Arial" w:hAnsi="Arial" w:cs="Arial"/>
-              </w:rPr>
-            </w:pPr>
-            <w:r>
-              <w:rPr>
-                <w:rFonts w:ascii="Arial" w:hAnsi="Arial" w:cs="Arial"/>
+                <w:lang w:val="en-US"/>
+              </w:rPr>
+            </w:pPr>
+            <w:r>
+              <w:rPr>
+                <w:rFonts w:ascii="Arial" w:hAnsi="Arial" w:cs="Arial"/>
+                <w:lang w:val="en-US"/>
               </w:rPr>
               <w:t>Amazon Web Services (s. f.-a)</w:t>
             </w:r>
@@ -2280,11 +2477,13 @@
               <w:spacing w:after="160" w:line="259" w:lineRule="auto"/>
               <w:rPr>
                 <w:rFonts w:ascii="Arial" w:hAnsi="Arial" w:cs="Arial"/>
-              </w:rPr>
-            </w:pPr>
-            <w:r>
-              <w:rPr>
-                <w:rFonts w:ascii="Arial" w:hAnsi="Arial" w:cs="Arial"/>
+                <w:lang w:val="pt-PT"/>
+              </w:rPr>
+            </w:pPr>
+            <w:r>
+              <w:rPr>
+                <w:rFonts w:ascii="Arial" w:hAnsi="Arial" w:cs="Arial"/>
+                <w:lang w:val="pt-PT"/>
               </w:rPr>
               <w:t>Aurora, instancia db.r6i.large</w:t>
             </w:r>
@@ -2320,11 +2519,13 @@
               <w:spacing w:after="160" w:line="259" w:lineRule="auto"/>
               <w:rPr>
                 <w:rFonts w:ascii="Arial" w:hAnsi="Arial" w:cs="Arial"/>
-              </w:rPr>
-            </w:pPr>
-            <w:r>
-              <w:rPr>
-                <w:rFonts w:ascii="Arial" w:hAnsi="Arial" w:cs="Arial"/>
+                <w:lang w:val="en-US"/>
+              </w:rPr>
+            </w:pPr>
+            <w:r>
+              <w:rPr>
+                <w:rFonts w:ascii="Arial" w:hAnsi="Arial" w:cs="Arial"/>
+                <w:lang w:val="en-US"/>
               </w:rPr>
               <w:t>Amazon Web Services (s. f.-a)</w:t>
             </w:r>
@@ -2382,11 +2583,13 @@
               <w:spacing w:after="160" w:line="259" w:lineRule="auto"/>
               <w:rPr>
                 <w:rFonts w:ascii="Arial" w:hAnsi="Arial" w:cs="Arial"/>
-              </w:rPr>
-            </w:pPr>
-            <w:r>
-              <w:rPr>
-                <w:rFonts w:ascii="Arial" w:hAnsi="Arial" w:cs="Arial"/>
+                <w:lang w:val="en-US"/>
+              </w:rPr>
+            </w:pPr>
+            <w:r>
+              <w:rPr>
+                <w:rFonts w:ascii="Arial" w:hAnsi="Arial" w:cs="Arial"/>
+                <w:lang w:val="en-US"/>
               </w:rPr>
               <w:t>Amazon Web Services (s. f.-b)</w:t>
             </w:r>
@@ -2508,11 +2711,19 @@
                 <w:rFonts w:ascii="Arial" w:hAnsi="Arial" w:cs="Arial"/>
               </w:rPr>
             </w:pPr>
-            <w:r>
-              <w:rPr>
-                <w:rFonts w:ascii="Arial" w:hAnsi="Arial" w:cs="Arial"/>
-              </w:rPr>
-              <w:t>Cloudian (s. f.)</w:t>
+            <w:proofErr w:type="spellStart"/>
+            <w:r>
+              <w:rPr>
+                <w:rFonts w:ascii="Arial" w:hAnsi="Arial" w:cs="Arial"/>
+              </w:rPr>
+              <w:t>Cloudian</w:t>
+            </w:r>
+            <w:proofErr w:type="spellEnd"/>
+            <w:r>
+              <w:rPr>
+                <w:rFonts w:ascii="Arial" w:hAnsi="Arial" w:cs="Arial"/>
+              </w:rPr>
+              <w:t xml:space="preserve"> (s. f.)</w:t>
             </w:r>
           </w:p>
         </w:tc>
@@ -2528,11 +2739,13 @@
               <w:spacing w:after="160" w:line="259" w:lineRule="auto"/>
               <w:rPr>
                 <w:rFonts w:ascii="Arial" w:hAnsi="Arial" w:cs="Arial"/>
-              </w:rPr>
-            </w:pPr>
-            <w:r>
-              <w:rPr>
-                <w:rFonts w:ascii="Arial" w:hAnsi="Arial" w:cs="Arial"/>
+                <w:lang w:val="en-US"/>
+              </w:rPr>
+            </w:pPr>
+            <w:r>
+              <w:rPr>
+                <w:rFonts w:ascii="Arial" w:hAnsi="Arial" w:cs="Arial"/>
+                <w:lang w:val="en-US"/>
               </w:rPr>
               <w:t>S3 Glacier Flexible Retrieval / Deep Archive</w:t>
             </w:r>
@@ -2570,11 +2783,19 @@
                 <w:rFonts w:ascii="Arial" w:hAnsi="Arial" w:cs="Arial"/>
               </w:rPr>
             </w:pPr>
-            <w:r>
-              <w:rPr>
-                <w:rFonts w:ascii="Arial" w:hAnsi="Arial" w:cs="Arial"/>
-              </w:rPr>
-              <w:t>Cloudian (s. f.)</w:t>
+            <w:proofErr w:type="spellStart"/>
+            <w:r>
+              <w:rPr>
+                <w:rFonts w:ascii="Arial" w:hAnsi="Arial" w:cs="Arial"/>
+              </w:rPr>
+              <w:t>Cloudian</w:t>
+            </w:r>
+            <w:proofErr w:type="spellEnd"/>
+            <w:r>
+              <w:rPr>
+                <w:rFonts w:ascii="Arial" w:hAnsi="Arial" w:cs="Arial"/>
+              </w:rPr>
+              <w:t xml:space="preserve"> (s. f.)</w:t>
             </w:r>
           </w:p>
         </w:tc>
@@ -2590,11 +2811,13 @@
               <w:spacing w:after="160" w:line="259" w:lineRule="auto"/>
               <w:rPr>
                 <w:rFonts w:ascii="Arial" w:hAnsi="Arial" w:cs="Arial"/>
-              </w:rPr>
-            </w:pPr>
-            <w:r>
-              <w:rPr>
-                <w:rFonts w:ascii="Arial" w:hAnsi="Arial" w:cs="Arial"/>
+                <w:lang w:val="en-US"/>
+              </w:rPr>
+            </w:pPr>
+            <w:r>
+              <w:rPr>
+                <w:rFonts w:ascii="Arial" w:hAnsi="Arial" w:cs="Arial"/>
+                <w:lang w:val="en-US"/>
               </w:rPr>
               <w:t>Azure Blob, Hot / Cool / Archive</w:t>
             </w:r>
@@ -2632,11 +2855,19 @@
                 <w:rFonts w:ascii="Arial" w:hAnsi="Arial" w:cs="Arial"/>
               </w:rPr>
             </w:pPr>
-            <w:r>
-              <w:rPr>
-                <w:rFonts w:ascii="Arial" w:hAnsi="Arial" w:cs="Arial"/>
-              </w:rPr>
-              <w:t>CloudZero (2026)</w:t>
+            <w:proofErr w:type="spellStart"/>
+            <w:r>
+              <w:rPr>
+                <w:rFonts w:ascii="Arial" w:hAnsi="Arial" w:cs="Arial"/>
+              </w:rPr>
+              <w:t>CloudZero</w:t>
+            </w:r>
+            <w:proofErr w:type="spellEnd"/>
+            <w:r>
+              <w:rPr>
+                <w:rFonts w:ascii="Arial" w:hAnsi="Arial" w:cs="Arial"/>
+              </w:rPr>
+              <w:t xml:space="preserve"> (2026)</w:t>
             </w:r>
           </w:p>
         </w:tc>
@@ -2694,11 +2925,19 @@
                 <w:rFonts w:ascii="Arial" w:hAnsi="Arial" w:cs="Arial"/>
               </w:rPr>
             </w:pPr>
-            <w:r>
-              <w:rPr>
-                <w:rFonts w:ascii="Arial" w:hAnsi="Arial" w:cs="Arial"/>
-              </w:rPr>
-              <w:t>Bytebase (s. f.)</w:t>
+            <w:proofErr w:type="spellStart"/>
+            <w:r>
+              <w:rPr>
+                <w:rFonts w:ascii="Arial" w:hAnsi="Arial" w:cs="Arial"/>
+              </w:rPr>
+              <w:t>Bytebase</w:t>
+            </w:r>
+            <w:proofErr w:type="spellEnd"/>
+            <w:r>
+              <w:rPr>
+                <w:rFonts w:ascii="Arial" w:hAnsi="Arial" w:cs="Arial"/>
+              </w:rPr>
+              <w:t xml:space="preserve"> (s. f.)</w:t>
             </w:r>
           </w:p>
         </w:tc>
@@ -3135,11 +3374,19 @@
                 <w:rFonts w:ascii="Arial" w:hAnsi="Arial" w:cs="Arial"/>
               </w:rPr>
             </w:pPr>
-            <w:r>
-              <w:rPr>
-                <w:rFonts w:ascii="Arial" w:hAnsi="Arial" w:cs="Arial"/>
-              </w:rPr>
-              <w:t>Total a 3 años</w:t>
+            <w:proofErr w:type="gramStart"/>
+            <w:r>
+              <w:rPr>
+                <w:rFonts w:ascii="Arial" w:hAnsi="Arial" w:cs="Arial"/>
+              </w:rPr>
+              <w:t>Total</w:t>
+            </w:r>
+            <w:proofErr w:type="gramEnd"/>
+            <w:r>
+              <w:rPr>
+                <w:rFonts w:ascii="Arial" w:hAnsi="Arial" w:cs="Arial"/>
+              </w:rPr>
+              <w:t xml:space="preserve"> a 3 años</w:t>
             </w:r>
           </w:p>
         </w:tc>
@@ -3317,7 +3564,21 @@
         <w:rPr>
           <w:rFonts w:ascii="Arial" w:hAnsi="Arial" w:cs="Arial"/>
         </w:rPr>
-        <w:t>La solución necesita un equipo de operación (DevOps y DBA) con monitoreo y soporte durante los estrenos, guías para atender incidentes y pruebas de carga antes de cada estreno grande. También hay que capacitar al personal de taquilla, puerta y contabilidad según su rol. La migración se haría por fases: primero unos cines piloto y después el resto, para no depender de una sola fecha de cambio. Como son servicios administrados, parches, respaldos y failover los maneja el proveedor, y eso baja mucho el trabajo de operación.</w:t>
+        <w:t xml:space="preserve">La solución necesita un equipo de operación (DevOps y DBA) con monitoreo y soporte durante los estrenos, guías para atender incidentes y pruebas de carga antes de cada estreno grande. También hay que capacitar al personal de taquilla, puerta y contabilidad según su rol. La migración se haría por fases: primero unos cines piloto y después el resto, para no depender de una sola fecha de cambio. Como son servicios administrados, parches, respaldos y </w:t>
+      </w:r>
+      <w:proofErr w:type="spellStart"/>
+      <w:r>
+        <w:rPr>
+          <w:rFonts w:ascii="Arial" w:hAnsi="Arial" w:cs="Arial"/>
+        </w:rPr>
+        <w:t>failover</w:t>
+      </w:r>
+      <w:proofErr w:type="spellEnd"/>
+      <w:r>
+        <w:rPr>
+          <w:rFonts w:ascii="Arial" w:hAnsi="Arial" w:cs="Arial"/>
+        </w:rPr>
+        <w:t xml:space="preserve"> los maneja el proveedor, y eso baja mucho el trabajo de operación.</w:t>
       </w:r>
     </w:p>
     <w:p>
@@ -3563,11 +3824,19 @@
                 <w:rFonts w:ascii="Arial" w:hAnsi="Arial" w:cs="Arial"/>
               </w:rPr>
             </w:pPr>
-            <w:r>
-              <w:rPr>
-                <w:rFonts w:ascii="Arial" w:hAnsi="Arial" w:cs="Arial"/>
-              </w:rPr>
-              <w:t>Failover automático a una réplica en otra zona y réplica multirregión</w:t>
+            <w:proofErr w:type="spellStart"/>
+            <w:r>
+              <w:rPr>
+                <w:rFonts w:ascii="Arial" w:hAnsi="Arial" w:cs="Arial"/>
+              </w:rPr>
+              <w:t>Failover</w:t>
+            </w:r>
+            <w:proofErr w:type="spellEnd"/>
+            <w:r>
+              <w:rPr>
+                <w:rFonts w:ascii="Arial" w:hAnsi="Arial" w:cs="Arial"/>
+              </w:rPr>
+              <w:t xml:space="preserve"> automático a una réplica en otra zona y réplica multirregión</w:t>
             </w:r>
           </w:p>
         </w:tc>
@@ -3751,7 +4020,21 @@
               <w:rPr>
                 <w:rFonts w:ascii="Arial" w:hAnsi="Arial" w:cs="Arial"/>
               </w:rPr>
-              <w:t>Ataque de denegación de servicio (DDoS)</w:t>
+              <w:t>Ataque de denegación de servicio (</w:t>
+            </w:r>
+            <w:proofErr w:type="spellStart"/>
+            <w:r>
+              <w:rPr>
+                <w:rFonts w:ascii="Arial" w:hAnsi="Arial" w:cs="Arial"/>
+              </w:rPr>
+              <w:t>DDoS</w:t>
+            </w:r>
+            <w:proofErr w:type="spellEnd"/>
+            <w:r>
+              <w:rPr>
+                <w:rFonts w:ascii="Arial" w:hAnsi="Arial" w:cs="Arial"/>
+              </w:rPr>
+              <w:t>)</w:t>
             </w:r>
           </w:p>
         </w:tc>
@@ -4063,11 +4346,19 @@
                 <w:rFonts w:ascii="Arial" w:hAnsi="Arial" w:cs="Arial"/>
               </w:rPr>
             </w:pPr>
-            <w:r>
-              <w:rPr>
-                <w:rFonts w:ascii="Arial" w:hAnsi="Arial" w:cs="Arial"/>
-              </w:rPr>
-              <w:t>Autoescalado, réplicas de lectura, caché de disponibilidad, colas y pruebas de carga antes del estreno</w:t>
+            <w:proofErr w:type="spellStart"/>
+            <w:r>
+              <w:rPr>
+                <w:rFonts w:ascii="Arial" w:hAnsi="Arial" w:cs="Arial"/>
+              </w:rPr>
+              <w:t>Autoescalado</w:t>
+            </w:r>
+            <w:proofErr w:type="spellEnd"/>
+            <w:r>
+              <w:rPr>
+                <w:rFonts w:ascii="Arial" w:hAnsi="Arial" w:cs="Arial"/>
+              </w:rPr>
+              <w:t>, réplicas de lectura, caché de disponibilidad, colas y pruebas de carga antes del estreno</w:t>
             </w:r>
           </w:p>
         </w:tc>
@@ -4568,8 +4859,16 @@
               <w:rPr>
                 <w:rFonts w:ascii="Arial" w:hAnsi="Arial" w:cs="Arial"/>
               </w:rPr>
-              <w:t>QR firmado y único, validación de un solo uso (RN-14) y registro en acceso_puerta_log</w:t>
-            </w:r>
+              <w:t xml:space="preserve">QR firmado y único, validación de un solo uso (RN-14) y registro en </w:t>
+            </w:r>
+            <w:proofErr w:type="spellStart"/>
+            <w:r>
+              <w:rPr>
+                <w:rFonts w:ascii="Arial" w:hAnsi="Arial" w:cs="Arial"/>
+              </w:rPr>
+              <w:t>acceso_puerta_log</w:t>
+            </w:r>
+            <w:proofErr w:type="spellEnd"/>
           </w:p>
         </w:tc>
         <w:tc>
@@ -4690,7 +4989,21 @@
               <w:rPr>
                 <w:rFonts w:ascii="Arial" w:hAnsi="Arial" w:cs="Arial"/>
               </w:rPr>
-              <w:t>RBAC y bitácora admin_operacion_audit con fecha, IP, rol y usuario, más revisión periódica</w:t>
+              <w:t xml:space="preserve">RBAC y bitácora </w:t>
+            </w:r>
+            <w:proofErr w:type="spellStart"/>
+            <w:r>
+              <w:rPr>
+                <w:rFonts w:ascii="Arial" w:hAnsi="Arial" w:cs="Arial"/>
+              </w:rPr>
+              <w:t>admin_operacion_audit</w:t>
+            </w:r>
+            <w:proofErr w:type="spellEnd"/>
+            <w:r>
+              <w:rPr>
+                <w:rFonts w:ascii="Arial" w:hAnsi="Arial" w:cs="Arial"/>
+              </w:rPr>
+              <w:t xml:space="preserve"> con fecha, IP, rol y usuario, más revisión periódica</w:t>
             </w:r>
           </w:p>
         </w:tc>
@@ -5120,7 +5433,63 @@
           <w:rFonts w:ascii="Arial" w:hAnsi="Arial" w:cs="Arial"/>
         </w:rPr>
         <w:br/>
-        <w:t>RF-12. Llevar cuatro bitácoras de auditoría con retención de 5 años: transaccion_log, asiento_auditoria_log, acceso_puerta_log y admin_operacion_audit. Regla relacionada: RN-20.</w:t>
+        <w:t xml:space="preserve">RF-12. Llevar cuatro bitácoras de auditoría con retención de 5 años: </w:t>
+      </w:r>
+      <w:proofErr w:type="spellStart"/>
+      <w:r>
+        <w:rPr>
+          <w:rFonts w:ascii="Arial" w:hAnsi="Arial" w:cs="Arial"/>
+        </w:rPr>
+        <w:t>transaccion_log</w:t>
+      </w:r>
+      <w:proofErr w:type="spellEnd"/>
+      <w:r>
+        <w:rPr>
+          <w:rFonts w:ascii="Arial" w:hAnsi="Arial" w:cs="Arial"/>
+        </w:rPr>
+        <w:t xml:space="preserve">, </w:t>
+      </w:r>
+      <w:proofErr w:type="spellStart"/>
+      <w:r>
+        <w:rPr>
+          <w:rFonts w:ascii="Arial" w:hAnsi="Arial" w:cs="Arial"/>
+        </w:rPr>
+        <w:t>asiento_auditoria_log</w:t>
+      </w:r>
+      <w:proofErr w:type="spellEnd"/>
+      <w:r>
+        <w:rPr>
+          <w:rFonts w:ascii="Arial" w:hAnsi="Arial" w:cs="Arial"/>
+        </w:rPr>
+        <w:t xml:space="preserve">, </w:t>
+      </w:r>
+      <w:proofErr w:type="spellStart"/>
+      <w:r>
+        <w:rPr>
+          <w:rFonts w:ascii="Arial" w:hAnsi="Arial" w:cs="Arial"/>
+        </w:rPr>
+        <w:t>acceso_puerta_log</w:t>
+      </w:r>
+      <w:proofErr w:type="spellEnd"/>
+      <w:r>
+        <w:rPr>
+          <w:rFonts w:ascii="Arial" w:hAnsi="Arial" w:cs="Arial"/>
+        </w:rPr>
+        <w:t xml:space="preserve"> y </w:t>
+      </w:r>
+      <w:proofErr w:type="spellStart"/>
+      <w:r>
+        <w:rPr>
+          <w:rFonts w:ascii="Arial" w:hAnsi="Arial" w:cs="Arial"/>
+        </w:rPr>
+        <w:t>admin_operacion_audit</w:t>
+      </w:r>
+      <w:proofErr w:type="spellEnd"/>
+      <w:r>
+        <w:rPr>
+          <w:rFonts w:ascii="Arial" w:hAnsi="Arial" w:cs="Arial"/>
+        </w:rPr>
+        <w:t>. Regla relacionada: RN-20.</w:t>
       </w:r>
     </w:p>
     <w:p>
@@ -5266,7 +5635,21 @@
           <w:rFonts w:ascii="Arial" w:hAnsi="Arial" w:cs="Arial"/>
         </w:rPr>
         <w:br/>
-        <w:t>RNF-05. Seguridad: cumplir PCI-DSS sin guardar el número completo de la tarjeta ni el CVV, cifrar los datos en tránsito y en reposo, usar WAF y protección DDoS y dar a cada rol solo los permisos que necesita.</w:t>
+        <w:t xml:space="preserve">RNF-05. Seguridad: cumplir PCI-DSS sin guardar el número completo de la tarjeta ni el CVV, cifrar los datos en tránsito y en reposo, usar WAF y protección </w:t>
+      </w:r>
+      <w:proofErr w:type="spellStart"/>
+      <w:r>
+        <w:rPr>
+          <w:rFonts w:ascii="Arial" w:hAnsi="Arial" w:cs="Arial"/>
+        </w:rPr>
+        <w:t>DDoS</w:t>
+      </w:r>
+      <w:proofErr w:type="spellEnd"/>
+      <w:r>
+        <w:rPr>
+          <w:rFonts w:ascii="Arial" w:hAnsi="Arial" w:cs="Arial"/>
+        </w:rPr>
+        <w:t xml:space="preserve"> y dar a cada rol solo los permisos que necesita.</w:t>
       </w:r>
     </w:p>
     <w:p>
@@ -5458,7 +5841,63 @@
         <w:rPr>
           <w:rFonts w:ascii="Arial" w:hAnsi="Arial" w:cs="Arial"/>
         </w:rPr>
-        <w:t>15.6 millones de transaccion_log, 120 millones de asiento_auditoria_log, 15.75 millones de acceso_puerta_log y 0.075 millones de admin_operacion_audit. Son unos 1,817 millones al año y unos 9,085 millones en 5 años. El espacio que ocupan está en la tabla de almacenamiento de la sección 1.2, con los supuestos que usamos.</w:t>
+        <w:t xml:space="preserve">15.6 millones de </w:t>
+      </w:r>
+      <w:proofErr w:type="spellStart"/>
+      <w:r>
+        <w:rPr>
+          <w:rFonts w:ascii="Arial" w:hAnsi="Arial" w:cs="Arial"/>
+        </w:rPr>
+        <w:t>transaccion_log</w:t>
+      </w:r>
+      <w:proofErr w:type="spellEnd"/>
+      <w:r>
+        <w:rPr>
+          <w:rFonts w:ascii="Arial" w:hAnsi="Arial" w:cs="Arial"/>
+        </w:rPr>
+        <w:t xml:space="preserve">, 120 millones de </w:t>
+      </w:r>
+      <w:proofErr w:type="spellStart"/>
+      <w:r>
+        <w:rPr>
+          <w:rFonts w:ascii="Arial" w:hAnsi="Arial" w:cs="Arial"/>
+        </w:rPr>
+        <w:t>asiento_auditoria_log</w:t>
+      </w:r>
+      <w:proofErr w:type="spellEnd"/>
+      <w:r>
+        <w:rPr>
+          <w:rFonts w:ascii="Arial" w:hAnsi="Arial" w:cs="Arial"/>
+        </w:rPr>
+        <w:t xml:space="preserve">, 15.75 millones de </w:t>
+      </w:r>
+      <w:proofErr w:type="spellStart"/>
+      <w:r>
+        <w:rPr>
+          <w:rFonts w:ascii="Arial" w:hAnsi="Arial" w:cs="Arial"/>
+        </w:rPr>
+        <w:t>acceso_puerta_log</w:t>
+      </w:r>
+      <w:proofErr w:type="spellEnd"/>
+      <w:r>
+        <w:rPr>
+          <w:rFonts w:ascii="Arial" w:hAnsi="Arial" w:cs="Arial"/>
+        </w:rPr>
+        <w:t xml:space="preserve"> y 0.075 millones de </w:t>
+      </w:r>
+      <w:proofErr w:type="spellStart"/>
+      <w:r>
+        <w:rPr>
+          <w:rFonts w:ascii="Arial" w:hAnsi="Arial" w:cs="Arial"/>
+        </w:rPr>
+        <w:t>admin_operacion_audit</w:t>
+      </w:r>
+      <w:proofErr w:type="spellEnd"/>
+      <w:r>
+        <w:rPr>
+          <w:rFonts w:ascii="Arial" w:hAnsi="Arial" w:cs="Arial"/>
+        </w:rPr>
+        <w:t>. Son unos 1,817 millones al año y unos 9,085 millones en 5 años. El espacio que ocupan está en la tabla de almacenamiento de la sección 1.2, con los supuestos que usamos.</w:t>
       </w:r>
     </w:p>
     <w:p>
@@ -5625,15 +6064,32 @@
     </w:p>
     <w:p>
       <w:r>
-        <w:t xml:space="preserve">Amazon Web Services. (s. f.-a). </w:t>
+        <w:t xml:space="preserve">Amazon Web </w:t>
+      </w:r>
+      <w:proofErr w:type="spellStart"/>
+      <w:r>
+        <w:t>Services</w:t>
+      </w:r>
+      <w:proofErr w:type="spellEnd"/>
+      <w:r>
+        <w:t xml:space="preserve">. (s. f.-a). </w:t>
       </w:r>
       <w:r>
         <w:rPr>
           <w:i/>
           <w:iCs/>
         </w:rPr>
-        <w:t>Amazon Aurora pricing</w:t>
-      </w:r>
+        <w:t xml:space="preserve">Amazon Aurora </w:t>
+      </w:r>
+      <w:proofErr w:type="spellStart"/>
+      <w:r>
+        <w:rPr>
+          <w:i/>
+          <w:iCs/>
+        </w:rPr>
+        <w:t>pricing</w:t>
+      </w:r>
+      <w:proofErr w:type="spellEnd"/>
       <w:r>
         <w:t xml:space="preserve">. Recuperado el 20 de octubre de 2026, de </w:t>
       </w:r>
@@ -5658,8 +6114,17 @@
           <w:i/>
           <w:iCs/>
         </w:rPr>
-        <w:t>AWS WAF pricing</w:t>
-      </w:r>
+        <w:t xml:space="preserve">AWS WAF </w:t>
+      </w:r>
+      <w:proofErr w:type="spellStart"/>
+      <w:r>
+        <w:rPr>
+          <w:i/>
+          <w:iCs/>
+        </w:rPr>
+        <w:t>pricing</w:t>
+      </w:r>
+      <w:proofErr w:type="spellEnd"/>
       <w:r>
         <w:t xml:space="preserve">. Recuperado el 20 de octubre de 2026, de </w:t>
       </w:r>
@@ -5673,16 +6138,62 @@
       </w:hyperlink>
     </w:p>
     <w:p>
-      <w:r>
-        <w:t xml:space="preserve">Bytebase. (s. f.). </w:t>
+      <w:proofErr w:type="spellStart"/>
+      <w:r>
+        <w:t>Bytebase</w:t>
+      </w:r>
+      <w:proofErr w:type="spellEnd"/>
+      <w:r>
+        <w:t xml:space="preserve">. (s. f.). </w:t>
       </w:r>
       <w:r>
         <w:rPr>
           <w:i/>
           <w:iCs/>
         </w:rPr>
-        <w:t>Azure Database for PostgreSQL &amp; MySQL pricing</w:t>
-      </w:r>
+        <w:t xml:space="preserve">Azure </w:t>
+      </w:r>
+      <w:proofErr w:type="spellStart"/>
+      <w:r>
+        <w:rPr>
+          <w:i/>
+          <w:iCs/>
+        </w:rPr>
+        <w:t>Database</w:t>
+      </w:r>
+      <w:proofErr w:type="spellEnd"/>
+      <w:r>
+        <w:rPr>
+          <w:i/>
+          <w:iCs/>
+        </w:rPr>
+        <w:t xml:space="preserve"> </w:t>
+      </w:r>
+      <w:proofErr w:type="spellStart"/>
+      <w:r>
+        <w:rPr>
+          <w:i/>
+          <w:iCs/>
+        </w:rPr>
+        <w:t>for</w:t>
+      </w:r>
+      <w:proofErr w:type="spellEnd"/>
+      <w:r>
+        <w:rPr>
+          <w:i/>
+          <w:iCs/>
+        </w:rPr>
+        <w:t xml:space="preserve"> PostgreSQL &amp; MySQL </w:t>
+      </w:r>
+      <w:proofErr w:type="spellStart"/>
+      <w:r>
+        <w:rPr>
+          <w:i/>
+          <w:iCs/>
+        </w:rPr>
+        <w:t>pricing</w:t>
+      </w:r>
+      <w:proofErr w:type="spellEnd"/>
       <w:r>
         <w:t xml:space="preserve">. Recuperado el 20 de octubre de 2026, de </w:t>
       </w:r>
@@ -5696,11 +6207,19 @@
       </w:hyperlink>
     </w:p>
     <w:p>
+      <w:proofErr w:type="spellStart"/>
       <w:r>
         <w:rPr>
           <w:lang w:val="en-US"/>
         </w:rPr>
-        <w:t xml:space="preserve">Cloudian. (s. f.). </w:t>
+        <w:t>Cloudian</w:t>
+      </w:r>
+      <w:proofErr w:type="spellEnd"/>
+      <w:r>
+        <w:rPr>
+          <w:lang w:val="en-US"/>
+        </w:rPr>
+        <w:t xml:space="preserve">. (s. f.). </w:t>
       </w:r>
       <w:r>
         <w:rPr>
@@ -5754,41 +6273,64 @@
         </w:rPr>
         <w:t xml:space="preserve">. </w:t>
       </w:r>
-      <w:hyperlink r:id="rId10" w:history="1">
-        <w:r>
-          <w:rPr>
-            <w:rStyle w:val="Hipervnculo"/>
-            <w:lang w:val="pt-PT"/>
-          </w:rPr>
-          <w:t>https://cloudzero.com/blog/azure-blob-storage-pricing</w:t>
-        </w:r>
-      </w:hyperlink>
-    </w:p>
-    <w:p>
+      <w:r>
+        <w:fldChar w:fldCharType="begin"/>
+      </w:r>
       <w:r>
         <w:rPr>
           <w:lang w:val="pt-PT"/>
         </w:rPr>
+        <w:instrText>HYPERLINK "https://cloudzero.com/blog/azure-blob-storage-pricing"</w:instrText>
+      </w:r>
+      <w:r>
+        <w:fldChar w:fldCharType="separate"/>
+      </w:r>
+      <w:r>
+        <w:rPr>
+          <w:rStyle w:val="Hipervnculo"/>
+          <w:lang w:val="pt-PT"/>
+        </w:rPr>
+        <w:t>https://cloudzero.com/blog/azure-blob-storage-pricing</w:t>
+      </w:r>
+      <w:r>
+        <w:fldChar w:fldCharType="end"/>
+      </w:r>
+    </w:p>
+    <w:p>
+      <w:r>
+        <w:rPr>
+          <w:lang w:val="pt-PT"/>
+        </w:rPr>
         <w:t xml:space="preserve">Google. (s. f.-a). </w:t>
       </w:r>
+      <w:proofErr w:type="gramStart"/>
       <w:r>
         <w:rPr>
           <w:i/>
           <w:iCs/>
           <w:lang w:val="en-US"/>
         </w:rPr>
-        <w:t>Files you can store in Google Drive</w:t>
-      </w:r>
-      <w:r>
-        <w:rPr>
+        <w:t>Files you can store</w:t>
+      </w:r>
+      <w:proofErr w:type="gramEnd"/>
+      <w:r>
+        <w:rPr>
+          <w:i/>
+          <w:iCs/>
           <w:lang w:val="en-US"/>
         </w:rPr>
+        <w:t xml:space="preserve"> in Google Drive</w:t>
+      </w:r>
+      <w:r>
+        <w:rPr>
+          <w:lang w:val="en-US"/>
+        </w:rPr>
         <w:t xml:space="preserve">. </w:t>
       </w:r>
       <w:r>
         <w:t xml:space="preserve">Ayuda de Google Drive. Recuperado el 20 de octubre de 2026, de </w:t>
       </w:r>
-      <w:hyperlink r:id="rId11" w:history="1">
+      <w:hyperlink r:id="rId10" w:history="1">
         <w:r>
           <w:rPr>
             <w:rStyle w:val="Hipervnculo"/>
@@ -5819,9 +6361,25 @@
         <w:t xml:space="preserve">. </w:t>
       </w:r>
       <w:r>
-        <w:t xml:space="preserve">Google for Developers. Recuperado el 20 de octubre de 2026, de </w:t>
-      </w:r>
-      <w:hyperlink r:id="rId12" w:history="1">
+        <w:t xml:space="preserve">Google </w:t>
+      </w:r>
+      <w:proofErr w:type="spellStart"/>
+      <w:r>
+        <w:t>for</w:t>
+      </w:r>
+      <w:proofErr w:type="spellEnd"/>
+      <w:r>
+        <w:t xml:space="preserve"> </w:t>
+      </w:r>
+      <w:proofErr w:type="spellStart"/>
+      <w:r>
+        <w:t>Developers</w:t>
+      </w:r>
+      <w:proofErr w:type="spellEnd"/>
+      <w:r>
+        <w:t xml:space="preserve">. Recuperado el 20 de octubre de 2026, de </w:t>
+      </w:r>
+      <w:hyperlink r:id="rId11" w:history="1">
         <w:r>
           <w:rPr>
             <w:rStyle w:val="Hipervnculo"/>
@@ -5837,7 +6395,23 @@
         </w:rPr>
       </w:pPr>
       <w:r>
-        <w:t xml:space="preserve">Google Workspace Updates. (2026, 10 de septiembre). </w:t>
+        <w:t xml:space="preserve">Google </w:t>
+      </w:r>
+      <w:proofErr w:type="spellStart"/>
+      <w:r>
+        <w:t>Workspace</w:t>
+      </w:r>
+      <w:proofErr w:type="spellEnd"/>
+      <w:r>
+        <w:t xml:space="preserve"> </w:t>
+      </w:r>
+      <w:proofErr w:type="spellStart"/>
+      <w:r>
+        <w:t>Updates</w:t>
+      </w:r>
+      <w:proofErr w:type="spellEnd"/>
+      <w:r>
+        <w:t xml:space="preserve">. (2026, 10 de septiembre). </w:t>
       </w:r>
       <w:r>
         <w:rPr>
@@ -5845,15 +6419,33 @@
           <w:iCs/>
           <w:lang w:val="en-US"/>
         </w:rPr>
-        <w:t>Doubled cell limits in Google Sheets now generally available</w:t>
-      </w:r>
-      <w:r>
-        <w:rPr>
+        <w:t xml:space="preserve">Doubled cell limits in Google Sheets </w:t>
+      </w:r>
+      <w:proofErr w:type="gramStart"/>
+      <w:r>
+        <w:rPr>
+          <w:i/>
+          <w:iCs/>
           <w:lang w:val="en-US"/>
         </w:rPr>
+        <w:t>now</w:t>
+      </w:r>
+      <w:proofErr w:type="gramEnd"/>
+      <w:r>
+        <w:rPr>
+          <w:i/>
+          <w:iCs/>
+          <w:lang w:val="en-US"/>
+        </w:rPr>
+        <w:t xml:space="preserve"> generally available</w:t>
+      </w:r>
+      <w:r>
+        <w:rPr>
+          <w:lang w:val="en-US"/>
+        </w:rPr>
         <w:t xml:space="preserve">. Workspace Updates Blog. </w:t>
       </w:r>
-      <w:hyperlink r:id="rId13" w:history="1">
+      <w:hyperlink r:id="rId12" w:history="1">
         <w:r>
           <w:rPr>
             <w:rStyle w:val="Hipervnculo"/>
@@ -5886,7 +6478,7 @@
         </w:rPr>
         <w:t xml:space="preserve"> PCI Security Standards Council Blog. </w:t>
       </w:r>
-      <w:hyperlink r:id="rId14" w:history="1">
+      <w:hyperlink r:id="rId13" w:history="1">
         <w:r>
           <w:rPr>
             <w:rStyle w:val="Hipervnculo"/>
@@ -5921,7 +6513,7 @@
       <w:r>
         <w:t xml:space="preserve">Azure. Recuperado el 20 de octubre de 2026, de </w:t>
       </w:r>
-      <w:hyperlink r:id="rId15" w:history="1">
+      <w:hyperlink r:id="rId14" w:history="1">
         <w:r>
           <w:rPr>
             <w:rStyle w:val="Hipervnculo"/>
@@ -5954,7 +6546,7 @@
       <w:r>
         <w:t xml:space="preserve">Recuperado el 20 de octubre de 2026, de </w:t>
       </w:r>
-      <w:hyperlink r:id="rId16" w:history="1">
+      <w:hyperlink r:id="rId15" w:history="1">
         <w:r>
           <w:rPr>
             <w:rStyle w:val="Hipervnculo"/>
@@ -5984,7 +6576,7 @@
         </w:rPr>
         <w:t xml:space="preserve">. </w:t>
       </w:r>
-      <w:hyperlink r:id="rId17" w:history="1">
+      <w:hyperlink r:id="rId16" w:history="1">
         <w:r>
           <w:rPr>
             <w:rStyle w:val="Hipervnculo"/>
@@ -6846,6 +7438,7 @@
   <w:style w:type="character" w:default="1" w:styleId="Fuentedeprrafopredeter">
     <w:name w:val="Default Paragraph Font"/>
     <w:uiPriority w:val="1"/>
+    <w:semiHidden/>
     <w:unhideWhenUsed/>
   </w:style>
   <w:style w:type="table" w:default="1" w:styleId="Tablanormal">

</xml_diff>

<commit_message>
base terminada, pruebas en py, y resultado en txt, capturas en la documuentación
</commit_message>
<xml_diff>
--- a/Documentación/Documetación II Proyecto BD.docx
+++ b/Documentación/Documetación II Proyecto BD.docx
@@ -6032,12 +6032,11 @@
       </w:pPr>
     </w:p>
     <w:p/>
-    <w:p/>
-    <w:p/>
-    <w:p/>
-    <w:p/>
-    <w:p/>
-    <w:p/>
+    <w:p>
+      <w:pPr>
+        <w:pStyle w:val="Subttulo"/>
+      </w:pPr>
+    </w:p>
     <w:p>
       <w:pPr>
         <w:pStyle w:val="Subttulo"/>
@@ -6059,6 +6058,724 @@
           <w:sz w:val="22"/>
           <w:szCs w:val="22"/>
         </w:rPr>
+        <w:t xml:space="preserve">Capturas de pantalla </w:t>
+      </w:r>
+    </w:p>
+    <w:p>
+      <w:r>
+        <w:drawing>
+          <wp:inline distT="0" distB="0" distL="0" distR="0" wp14:anchorId="7DBF8E05" wp14:editId="3F756186">
+            <wp:extent cx="5612130" cy="2980690"/>
+            <wp:effectExtent l="0" t="0" r="7620" b="0"/>
+            <wp:docPr id="1815822743" name="Imagen 1"/>
+            <wp:cNvGraphicFramePr>
+              <a:graphicFrameLocks xmlns:a="http://schemas.openxmlformats.org/drawingml/2006/main" noChangeAspect="1"/>
+            </wp:cNvGraphicFramePr>
+            <a:graphic xmlns:a="http://schemas.openxmlformats.org/drawingml/2006/main">
+              <a:graphicData uri="http://schemas.openxmlformats.org/drawingml/2006/picture">
+                <pic:pic xmlns:pic="http://schemas.openxmlformats.org/drawingml/2006/picture">
+                  <pic:nvPicPr>
+                    <pic:cNvPr id="1815822743" name=""/>
+                    <pic:cNvPicPr/>
+                  </pic:nvPicPr>
+                  <pic:blipFill>
+                    <a:blip r:embed="rId6"/>
+                    <a:stretch>
+                      <a:fillRect/>
+                    </a:stretch>
+                  </pic:blipFill>
+                  <pic:spPr>
+                    <a:xfrm>
+                      <a:off x="0" y="0"/>
+                      <a:ext cx="5612130" cy="2980690"/>
+                    </a:xfrm>
+                    <a:prstGeom prst="rect">
+                      <a:avLst/>
+                    </a:prstGeom>
+                  </pic:spPr>
+                </pic:pic>
+              </a:graphicData>
+            </a:graphic>
+          </wp:inline>
+        </w:drawing>
+      </w:r>
+    </w:p>
+    <w:p/>
+    <w:p/>
+    <w:p>
+      <w:r>
+        <w:drawing>
+          <wp:inline distT="0" distB="0" distL="0" distR="0" wp14:anchorId="2A42CDB8" wp14:editId="5D4F2EB0">
+            <wp:extent cx="5612130" cy="2964815"/>
+            <wp:effectExtent l="0" t="0" r="7620" b="6985"/>
+            <wp:docPr id="1577611448" name="Imagen 1"/>
+            <wp:cNvGraphicFramePr>
+              <a:graphicFrameLocks xmlns:a="http://schemas.openxmlformats.org/drawingml/2006/main" noChangeAspect="1"/>
+            </wp:cNvGraphicFramePr>
+            <a:graphic xmlns:a="http://schemas.openxmlformats.org/drawingml/2006/main">
+              <a:graphicData uri="http://schemas.openxmlformats.org/drawingml/2006/picture">
+                <pic:pic xmlns:pic="http://schemas.openxmlformats.org/drawingml/2006/picture">
+                  <pic:nvPicPr>
+                    <pic:cNvPr id="1577611448" name=""/>
+                    <pic:cNvPicPr/>
+                  </pic:nvPicPr>
+                  <pic:blipFill>
+                    <a:blip r:embed="rId7"/>
+                    <a:stretch>
+                      <a:fillRect/>
+                    </a:stretch>
+                  </pic:blipFill>
+                  <pic:spPr>
+                    <a:xfrm>
+                      <a:off x="0" y="0"/>
+                      <a:ext cx="5612130" cy="2964815"/>
+                    </a:xfrm>
+                    <a:prstGeom prst="rect">
+                      <a:avLst/>
+                    </a:prstGeom>
+                  </pic:spPr>
+                </pic:pic>
+              </a:graphicData>
+            </a:graphic>
+          </wp:inline>
+        </w:drawing>
+      </w:r>
+    </w:p>
+    <w:p/>
+    <w:p>
+      <w:r>
+        <w:drawing>
+          <wp:inline distT="0" distB="0" distL="0" distR="0" wp14:anchorId="533E4EC3" wp14:editId="469DBE48">
+            <wp:extent cx="5612130" cy="2974975"/>
+            <wp:effectExtent l="0" t="0" r="7620" b="0"/>
+            <wp:docPr id="20652471" name="Imagen 1"/>
+            <wp:cNvGraphicFramePr>
+              <a:graphicFrameLocks xmlns:a="http://schemas.openxmlformats.org/drawingml/2006/main" noChangeAspect="1"/>
+            </wp:cNvGraphicFramePr>
+            <a:graphic xmlns:a="http://schemas.openxmlformats.org/drawingml/2006/main">
+              <a:graphicData uri="http://schemas.openxmlformats.org/drawingml/2006/picture">
+                <pic:pic xmlns:pic="http://schemas.openxmlformats.org/drawingml/2006/picture">
+                  <pic:nvPicPr>
+                    <pic:cNvPr id="20652471" name=""/>
+                    <pic:cNvPicPr/>
+                  </pic:nvPicPr>
+                  <pic:blipFill>
+                    <a:blip r:embed="rId8"/>
+                    <a:stretch>
+                      <a:fillRect/>
+                    </a:stretch>
+                  </pic:blipFill>
+                  <pic:spPr>
+                    <a:xfrm>
+                      <a:off x="0" y="0"/>
+                      <a:ext cx="5612130" cy="2974975"/>
+                    </a:xfrm>
+                    <a:prstGeom prst="rect">
+                      <a:avLst/>
+                    </a:prstGeom>
+                  </pic:spPr>
+                </pic:pic>
+              </a:graphicData>
+            </a:graphic>
+          </wp:inline>
+        </w:drawing>
+      </w:r>
+    </w:p>
+    <w:p/>
+    <w:p/>
+    <w:p>
+      <w:r>
+        <w:drawing>
+          <wp:inline distT="0" distB="0" distL="0" distR="0" wp14:anchorId="0D14675F" wp14:editId="070D5E83">
+            <wp:extent cx="5612130" cy="2968625"/>
+            <wp:effectExtent l="0" t="0" r="7620" b="3175"/>
+            <wp:docPr id="2054384783" name="Imagen 1"/>
+            <wp:cNvGraphicFramePr>
+              <a:graphicFrameLocks xmlns:a="http://schemas.openxmlformats.org/drawingml/2006/main" noChangeAspect="1"/>
+            </wp:cNvGraphicFramePr>
+            <a:graphic xmlns:a="http://schemas.openxmlformats.org/drawingml/2006/main">
+              <a:graphicData uri="http://schemas.openxmlformats.org/drawingml/2006/picture">
+                <pic:pic xmlns:pic="http://schemas.openxmlformats.org/drawingml/2006/picture">
+                  <pic:nvPicPr>
+                    <pic:cNvPr id="2054384783" name=""/>
+                    <pic:cNvPicPr/>
+                  </pic:nvPicPr>
+                  <pic:blipFill>
+                    <a:blip r:embed="rId9"/>
+                    <a:stretch>
+                      <a:fillRect/>
+                    </a:stretch>
+                  </pic:blipFill>
+                  <pic:spPr>
+                    <a:xfrm>
+                      <a:off x="0" y="0"/>
+                      <a:ext cx="5612130" cy="2968625"/>
+                    </a:xfrm>
+                    <a:prstGeom prst="rect">
+                      <a:avLst/>
+                    </a:prstGeom>
+                  </pic:spPr>
+                </pic:pic>
+              </a:graphicData>
+            </a:graphic>
+          </wp:inline>
+        </w:drawing>
+      </w:r>
+    </w:p>
+    <w:p/>
+    <w:p>
+      <w:r>
+        <w:lastRenderedPageBreak/>
+        <w:drawing>
+          <wp:inline distT="0" distB="0" distL="0" distR="0" wp14:anchorId="190484F1" wp14:editId="5221F62D">
+            <wp:extent cx="5612130" cy="2981325"/>
+            <wp:effectExtent l="0" t="0" r="7620" b="9525"/>
+            <wp:docPr id="1903489731" name="Imagen 1"/>
+            <wp:cNvGraphicFramePr>
+              <a:graphicFrameLocks xmlns:a="http://schemas.openxmlformats.org/drawingml/2006/main" noChangeAspect="1"/>
+            </wp:cNvGraphicFramePr>
+            <a:graphic xmlns:a="http://schemas.openxmlformats.org/drawingml/2006/main">
+              <a:graphicData uri="http://schemas.openxmlformats.org/drawingml/2006/picture">
+                <pic:pic xmlns:pic="http://schemas.openxmlformats.org/drawingml/2006/picture">
+                  <pic:nvPicPr>
+                    <pic:cNvPr id="1903489731" name=""/>
+                    <pic:cNvPicPr/>
+                  </pic:nvPicPr>
+                  <pic:blipFill>
+                    <a:blip r:embed="rId10"/>
+                    <a:stretch>
+                      <a:fillRect/>
+                    </a:stretch>
+                  </pic:blipFill>
+                  <pic:spPr>
+                    <a:xfrm>
+                      <a:off x="0" y="0"/>
+                      <a:ext cx="5612130" cy="2981325"/>
+                    </a:xfrm>
+                    <a:prstGeom prst="rect">
+                      <a:avLst/>
+                    </a:prstGeom>
+                  </pic:spPr>
+                </pic:pic>
+              </a:graphicData>
+            </a:graphic>
+          </wp:inline>
+        </w:drawing>
+      </w:r>
+    </w:p>
+    <w:p/>
+    <w:p/>
+    <w:p>
+      <w:r>
+        <w:drawing>
+          <wp:inline distT="0" distB="0" distL="0" distR="0" wp14:anchorId="18118F09" wp14:editId="689FA67F">
+            <wp:extent cx="5612130" cy="2962910"/>
+            <wp:effectExtent l="0" t="0" r="7620" b="8890"/>
+            <wp:docPr id="446122322" name="Imagen 1"/>
+            <wp:cNvGraphicFramePr>
+              <a:graphicFrameLocks xmlns:a="http://schemas.openxmlformats.org/drawingml/2006/main" noChangeAspect="1"/>
+            </wp:cNvGraphicFramePr>
+            <a:graphic xmlns:a="http://schemas.openxmlformats.org/drawingml/2006/main">
+              <a:graphicData uri="http://schemas.openxmlformats.org/drawingml/2006/picture">
+                <pic:pic xmlns:pic="http://schemas.openxmlformats.org/drawingml/2006/picture">
+                  <pic:nvPicPr>
+                    <pic:cNvPr id="446122322" name=""/>
+                    <pic:cNvPicPr/>
+                  </pic:nvPicPr>
+                  <pic:blipFill>
+                    <a:blip r:embed="rId11"/>
+                    <a:stretch>
+                      <a:fillRect/>
+                    </a:stretch>
+                  </pic:blipFill>
+                  <pic:spPr>
+                    <a:xfrm>
+                      <a:off x="0" y="0"/>
+                      <a:ext cx="5612130" cy="2962910"/>
+                    </a:xfrm>
+                    <a:prstGeom prst="rect">
+                      <a:avLst/>
+                    </a:prstGeom>
+                  </pic:spPr>
+                </pic:pic>
+              </a:graphicData>
+            </a:graphic>
+          </wp:inline>
+        </w:drawing>
+      </w:r>
+    </w:p>
+    <w:p/>
+    <w:p>
+      <w:r>
+        <w:lastRenderedPageBreak/>
+        <w:drawing>
+          <wp:inline distT="0" distB="0" distL="0" distR="0" wp14:anchorId="29F77207" wp14:editId="08D69C4A">
+            <wp:extent cx="5612130" cy="2964815"/>
+            <wp:effectExtent l="0" t="0" r="7620" b="6985"/>
+            <wp:docPr id="431243294" name="Imagen 1"/>
+            <wp:cNvGraphicFramePr>
+              <a:graphicFrameLocks xmlns:a="http://schemas.openxmlformats.org/drawingml/2006/main" noChangeAspect="1"/>
+            </wp:cNvGraphicFramePr>
+            <a:graphic xmlns:a="http://schemas.openxmlformats.org/drawingml/2006/main">
+              <a:graphicData uri="http://schemas.openxmlformats.org/drawingml/2006/picture">
+                <pic:pic xmlns:pic="http://schemas.openxmlformats.org/drawingml/2006/picture">
+                  <pic:nvPicPr>
+                    <pic:cNvPr id="431243294" name=""/>
+                    <pic:cNvPicPr/>
+                  </pic:nvPicPr>
+                  <pic:blipFill>
+                    <a:blip r:embed="rId12"/>
+                    <a:stretch>
+                      <a:fillRect/>
+                    </a:stretch>
+                  </pic:blipFill>
+                  <pic:spPr>
+                    <a:xfrm>
+                      <a:off x="0" y="0"/>
+                      <a:ext cx="5612130" cy="2964815"/>
+                    </a:xfrm>
+                    <a:prstGeom prst="rect">
+                      <a:avLst/>
+                    </a:prstGeom>
+                  </pic:spPr>
+                </pic:pic>
+              </a:graphicData>
+            </a:graphic>
+          </wp:inline>
+        </w:drawing>
+      </w:r>
+    </w:p>
+    <w:p/>
+    <w:p/>
+    <w:p>
+      <w:r>
+        <w:drawing>
+          <wp:inline distT="0" distB="0" distL="0" distR="0" wp14:anchorId="0EA16E33" wp14:editId="124884AD">
+            <wp:extent cx="5612130" cy="2997835"/>
+            <wp:effectExtent l="0" t="0" r="7620" b="0"/>
+            <wp:docPr id="1854725694" name="Imagen 1"/>
+            <wp:cNvGraphicFramePr>
+              <a:graphicFrameLocks xmlns:a="http://schemas.openxmlformats.org/drawingml/2006/main" noChangeAspect="1"/>
+            </wp:cNvGraphicFramePr>
+            <a:graphic xmlns:a="http://schemas.openxmlformats.org/drawingml/2006/main">
+              <a:graphicData uri="http://schemas.openxmlformats.org/drawingml/2006/picture">
+                <pic:pic xmlns:pic="http://schemas.openxmlformats.org/drawingml/2006/picture">
+                  <pic:nvPicPr>
+                    <pic:cNvPr id="1854725694" name=""/>
+                    <pic:cNvPicPr/>
+                  </pic:nvPicPr>
+                  <pic:blipFill>
+                    <a:blip r:embed="rId13"/>
+                    <a:stretch>
+                      <a:fillRect/>
+                    </a:stretch>
+                  </pic:blipFill>
+                  <pic:spPr>
+                    <a:xfrm>
+                      <a:off x="0" y="0"/>
+                      <a:ext cx="5612130" cy="2997835"/>
+                    </a:xfrm>
+                    <a:prstGeom prst="rect">
+                      <a:avLst/>
+                    </a:prstGeom>
+                  </pic:spPr>
+                </pic:pic>
+              </a:graphicData>
+            </a:graphic>
+          </wp:inline>
+        </w:drawing>
+      </w:r>
+    </w:p>
+    <w:p>
+      <w:r>
+        <w:lastRenderedPageBreak/>
+        <w:drawing>
+          <wp:inline distT="0" distB="0" distL="0" distR="0" wp14:anchorId="1C331A23" wp14:editId="350BEE52">
+            <wp:extent cx="5612130" cy="2950210"/>
+            <wp:effectExtent l="0" t="0" r="7620" b="2540"/>
+            <wp:docPr id="1776027185" name="Imagen 1"/>
+            <wp:cNvGraphicFramePr>
+              <a:graphicFrameLocks xmlns:a="http://schemas.openxmlformats.org/drawingml/2006/main" noChangeAspect="1"/>
+            </wp:cNvGraphicFramePr>
+            <a:graphic xmlns:a="http://schemas.openxmlformats.org/drawingml/2006/main">
+              <a:graphicData uri="http://schemas.openxmlformats.org/drawingml/2006/picture">
+                <pic:pic xmlns:pic="http://schemas.openxmlformats.org/drawingml/2006/picture">
+                  <pic:nvPicPr>
+                    <pic:cNvPr id="1776027185" name=""/>
+                    <pic:cNvPicPr/>
+                  </pic:nvPicPr>
+                  <pic:blipFill>
+                    <a:blip r:embed="rId14"/>
+                    <a:stretch>
+                      <a:fillRect/>
+                    </a:stretch>
+                  </pic:blipFill>
+                  <pic:spPr>
+                    <a:xfrm>
+                      <a:off x="0" y="0"/>
+                      <a:ext cx="5612130" cy="2950210"/>
+                    </a:xfrm>
+                    <a:prstGeom prst="rect">
+                      <a:avLst/>
+                    </a:prstGeom>
+                  </pic:spPr>
+                </pic:pic>
+              </a:graphicData>
+            </a:graphic>
+          </wp:inline>
+        </w:drawing>
+      </w:r>
+    </w:p>
+    <w:p/>
+    <w:p/>
+    <w:p>
+      <w:r>
+        <w:drawing>
+          <wp:inline distT="0" distB="0" distL="0" distR="0" wp14:anchorId="549B1704" wp14:editId="62A50358">
+            <wp:extent cx="5612130" cy="2985135"/>
+            <wp:effectExtent l="0" t="0" r="7620" b="5715"/>
+            <wp:docPr id="1397158365" name="Imagen 1"/>
+            <wp:cNvGraphicFramePr>
+              <a:graphicFrameLocks xmlns:a="http://schemas.openxmlformats.org/drawingml/2006/main" noChangeAspect="1"/>
+            </wp:cNvGraphicFramePr>
+            <a:graphic xmlns:a="http://schemas.openxmlformats.org/drawingml/2006/main">
+              <a:graphicData uri="http://schemas.openxmlformats.org/drawingml/2006/picture">
+                <pic:pic xmlns:pic="http://schemas.openxmlformats.org/drawingml/2006/picture">
+                  <pic:nvPicPr>
+                    <pic:cNvPr id="1397158365" name=""/>
+                    <pic:cNvPicPr/>
+                  </pic:nvPicPr>
+                  <pic:blipFill>
+                    <a:blip r:embed="rId15"/>
+                    <a:stretch>
+                      <a:fillRect/>
+                    </a:stretch>
+                  </pic:blipFill>
+                  <pic:spPr>
+                    <a:xfrm>
+                      <a:off x="0" y="0"/>
+                      <a:ext cx="5612130" cy="2985135"/>
+                    </a:xfrm>
+                    <a:prstGeom prst="rect">
+                      <a:avLst/>
+                    </a:prstGeom>
+                  </pic:spPr>
+                </pic:pic>
+              </a:graphicData>
+            </a:graphic>
+          </wp:inline>
+        </w:drawing>
+      </w:r>
+    </w:p>
+    <w:p/>
+    <w:p>
+      <w:r>
+        <w:lastRenderedPageBreak/>
+        <w:drawing>
+          <wp:inline distT="0" distB="0" distL="0" distR="0" wp14:anchorId="120694A1" wp14:editId="04FC32C3">
+            <wp:extent cx="5612130" cy="2976880"/>
+            <wp:effectExtent l="0" t="0" r="7620" b="0"/>
+            <wp:docPr id="1892927925" name="Imagen 1"/>
+            <wp:cNvGraphicFramePr>
+              <a:graphicFrameLocks xmlns:a="http://schemas.openxmlformats.org/drawingml/2006/main" noChangeAspect="1"/>
+            </wp:cNvGraphicFramePr>
+            <a:graphic xmlns:a="http://schemas.openxmlformats.org/drawingml/2006/main">
+              <a:graphicData uri="http://schemas.openxmlformats.org/drawingml/2006/picture">
+                <pic:pic xmlns:pic="http://schemas.openxmlformats.org/drawingml/2006/picture">
+                  <pic:nvPicPr>
+                    <pic:cNvPr id="1892927925" name=""/>
+                    <pic:cNvPicPr/>
+                  </pic:nvPicPr>
+                  <pic:blipFill>
+                    <a:blip r:embed="rId16"/>
+                    <a:stretch>
+                      <a:fillRect/>
+                    </a:stretch>
+                  </pic:blipFill>
+                  <pic:spPr>
+                    <a:xfrm>
+                      <a:off x="0" y="0"/>
+                      <a:ext cx="5612130" cy="2976880"/>
+                    </a:xfrm>
+                    <a:prstGeom prst="rect">
+                      <a:avLst/>
+                    </a:prstGeom>
+                  </pic:spPr>
+                </pic:pic>
+              </a:graphicData>
+            </a:graphic>
+          </wp:inline>
+        </w:drawing>
+      </w:r>
+    </w:p>
+    <w:p/>
+    <w:p/>
+    <w:p>
+      <w:r>
+        <w:drawing>
+          <wp:inline distT="0" distB="0" distL="0" distR="0" wp14:anchorId="133E1275" wp14:editId="0223C9CB">
+            <wp:extent cx="5612130" cy="2990215"/>
+            <wp:effectExtent l="0" t="0" r="7620" b="635"/>
+            <wp:docPr id="1237175528" name="Imagen 1"/>
+            <wp:cNvGraphicFramePr>
+              <a:graphicFrameLocks xmlns:a="http://schemas.openxmlformats.org/drawingml/2006/main" noChangeAspect="1"/>
+            </wp:cNvGraphicFramePr>
+            <a:graphic xmlns:a="http://schemas.openxmlformats.org/drawingml/2006/main">
+              <a:graphicData uri="http://schemas.openxmlformats.org/drawingml/2006/picture">
+                <pic:pic xmlns:pic="http://schemas.openxmlformats.org/drawingml/2006/picture">
+                  <pic:nvPicPr>
+                    <pic:cNvPr id="1237175528" name=""/>
+                    <pic:cNvPicPr/>
+                  </pic:nvPicPr>
+                  <pic:blipFill>
+                    <a:blip r:embed="rId17"/>
+                    <a:stretch>
+                      <a:fillRect/>
+                    </a:stretch>
+                  </pic:blipFill>
+                  <pic:spPr>
+                    <a:xfrm>
+                      <a:off x="0" y="0"/>
+                      <a:ext cx="5612130" cy="2990215"/>
+                    </a:xfrm>
+                    <a:prstGeom prst="rect">
+                      <a:avLst/>
+                    </a:prstGeom>
+                  </pic:spPr>
+                </pic:pic>
+              </a:graphicData>
+            </a:graphic>
+          </wp:inline>
+        </w:drawing>
+      </w:r>
+    </w:p>
+    <w:p/>
+    <w:p>
+      <w:r>
+        <w:lastRenderedPageBreak/>
+        <w:drawing>
+          <wp:inline distT="0" distB="0" distL="0" distR="0" wp14:anchorId="53D82B2F" wp14:editId="06E7A121">
+            <wp:extent cx="5612130" cy="2102485"/>
+            <wp:effectExtent l="0" t="0" r="7620" b="0"/>
+            <wp:docPr id="133314848" name="Imagen 1"/>
+            <wp:cNvGraphicFramePr>
+              <a:graphicFrameLocks xmlns:a="http://schemas.openxmlformats.org/drawingml/2006/main" noChangeAspect="1"/>
+            </wp:cNvGraphicFramePr>
+            <a:graphic xmlns:a="http://schemas.openxmlformats.org/drawingml/2006/main">
+              <a:graphicData uri="http://schemas.openxmlformats.org/drawingml/2006/picture">
+                <pic:pic xmlns:pic="http://schemas.openxmlformats.org/drawingml/2006/picture">
+                  <pic:nvPicPr>
+                    <pic:cNvPr id="133314848" name=""/>
+                    <pic:cNvPicPr/>
+                  </pic:nvPicPr>
+                  <pic:blipFill>
+                    <a:blip r:embed="rId18"/>
+                    <a:stretch>
+                      <a:fillRect/>
+                    </a:stretch>
+                  </pic:blipFill>
+                  <pic:spPr>
+                    <a:xfrm>
+                      <a:off x="0" y="0"/>
+                      <a:ext cx="5612130" cy="2102485"/>
+                    </a:xfrm>
+                    <a:prstGeom prst="rect">
+                      <a:avLst/>
+                    </a:prstGeom>
+                  </pic:spPr>
+                </pic:pic>
+              </a:graphicData>
+            </a:graphic>
+          </wp:inline>
+        </w:drawing>
+      </w:r>
+    </w:p>
+    <w:p/>
+    <w:p/>
+    <w:p>
+      <w:r>
+        <w:drawing>
+          <wp:inline distT="0" distB="0" distL="0" distR="0" wp14:anchorId="039B2FFA" wp14:editId="58E99B7F">
+            <wp:extent cx="5612130" cy="1660525"/>
+            <wp:effectExtent l="0" t="0" r="7620" b="0"/>
+            <wp:docPr id="351439921" name="Imagen 1"/>
+            <wp:cNvGraphicFramePr>
+              <a:graphicFrameLocks xmlns:a="http://schemas.openxmlformats.org/drawingml/2006/main" noChangeAspect="1"/>
+            </wp:cNvGraphicFramePr>
+            <a:graphic xmlns:a="http://schemas.openxmlformats.org/drawingml/2006/main">
+              <a:graphicData uri="http://schemas.openxmlformats.org/drawingml/2006/picture">
+                <pic:pic xmlns:pic="http://schemas.openxmlformats.org/drawingml/2006/picture">
+                  <pic:nvPicPr>
+                    <pic:cNvPr id="351439921" name=""/>
+                    <pic:cNvPicPr/>
+                  </pic:nvPicPr>
+                  <pic:blipFill>
+                    <a:blip r:embed="rId19"/>
+                    <a:stretch>
+                      <a:fillRect/>
+                    </a:stretch>
+                  </pic:blipFill>
+                  <pic:spPr>
+                    <a:xfrm>
+                      <a:off x="0" y="0"/>
+                      <a:ext cx="5612130" cy="1660525"/>
+                    </a:xfrm>
+                    <a:prstGeom prst="rect">
+                      <a:avLst/>
+                    </a:prstGeom>
+                  </pic:spPr>
+                </pic:pic>
+              </a:graphicData>
+            </a:graphic>
+          </wp:inline>
+        </w:drawing>
+      </w:r>
+    </w:p>
+    <w:p/>
+    <w:p/>
+    <w:p>
+      <w:r>
+        <w:drawing>
+          <wp:inline distT="0" distB="0" distL="0" distR="0" wp14:anchorId="243E188D" wp14:editId="234B3BCA">
+            <wp:extent cx="5612130" cy="1490980"/>
+            <wp:effectExtent l="0" t="0" r="7620" b="0"/>
+            <wp:docPr id="502395892" name="Imagen 1"/>
+            <wp:cNvGraphicFramePr>
+              <a:graphicFrameLocks xmlns:a="http://schemas.openxmlformats.org/drawingml/2006/main" noChangeAspect="1"/>
+            </wp:cNvGraphicFramePr>
+            <a:graphic xmlns:a="http://schemas.openxmlformats.org/drawingml/2006/main">
+              <a:graphicData uri="http://schemas.openxmlformats.org/drawingml/2006/picture">
+                <pic:pic xmlns:pic="http://schemas.openxmlformats.org/drawingml/2006/picture">
+                  <pic:nvPicPr>
+                    <pic:cNvPr id="502395892" name=""/>
+                    <pic:cNvPicPr/>
+                  </pic:nvPicPr>
+                  <pic:blipFill>
+                    <a:blip r:embed="rId20"/>
+                    <a:stretch>
+                      <a:fillRect/>
+                    </a:stretch>
+                  </pic:blipFill>
+                  <pic:spPr>
+                    <a:xfrm>
+                      <a:off x="0" y="0"/>
+                      <a:ext cx="5612130" cy="1490980"/>
+                    </a:xfrm>
+                    <a:prstGeom prst="rect">
+                      <a:avLst/>
+                    </a:prstGeom>
+                  </pic:spPr>
+                </pic:pic>
+              </a:graphicData>
+            </a:graphic>
+          </wp:inline>
+        </w:drawing>
+      </w:r>
+    </w:p>
+    <w:p/>
+    <w:p/>
+    <w:p>
+      <w:r>
+        <w:lastRenderedPageBreak/>
+        <w:drawing>
+          <wp:inline distT="0" distB="0" distL="0" distR="0" wp14:anchorId="5952C340" wp14:editId="7AB7461B">
+            <wp:extent cx="5612130" cy="1536065"/>
+            <wp:effectExtent l="0" t="0" r="7620" b="6985"/>
+            <wp:docPr id="138517657" name="Imagen 1"/>
+            <wp:cNvGraphicFramePr>
+              <a:graphicFrameLocks xmlns:a="http://schemas.openxmlformats.org/drawingml/2006/main" noChangeAspect="1"/>
+            </wp:cNvGraphicFramePr>
+            <a:graphic xmlns:a="http://schemas.openxmlformats.org/drawingml/2006/main">
+              <a:graphicData uri="http://schemas.openxmlformats.org/drawingml/2006/picture">
+                <pic:pic xmlns:pic="http://schemas.openxmlformats.org/drawingml/2006/picture">
+                  <pic:nvPicPr>
+                    <pic:cNvPr id="138517657" name=""/>
+                    <pic:cNvPicPr/>
+                  </pic:nvPicPr>
+                  <pic:blipFill>
+                    <a:blip r:embed="rId21"/>
+                    <a:stretch>
+                      <a:fillRect/>
+                    </a:stretch>
+                  </pic:blipFill>
+                  <pic:spPr>
+                    <a:xfrm>
+                      <a:off x="0" y="0"/>
+                      <a:ext cx="5612130" cy="1536065"/>
+                    </a:xfrm>
+                    <a:prstGeom prst="rect">
+                      <a:avLst/>
+                    </a:prstGeom>
+                  </pic:spPr>
+                </pic:pic>
+              </a:graphicData>
+            </a:graphic>
+          </wp:inline>
+        </w:drawing>
+      </w:r>
+    </w:p>
+    <w:p/>
+    <w:p/>
+    <w:p>
+      <w:r>
+        <w:drawing>
+          <wp:inline distT="0" distB="0" distL="0" distR="0" wp14:anchorId="39448697" wp14:editId="292CD540">
+            <wp:extent cx="5612130" cy="1951990"/>
+            <wp:effectExtent l="0" t="0" r="7620" b="0"/>
+            <wp:docPr id="907063603" name="Imagen 1"/>
+            <wp:cNvGraphicFramePr>
+              <a:graphicFrameLocks xmlns:a="http://schemas.openxmlformats.org/drawingml/2006/main" noChangeAspect="1"/>
+            </wp:cNvGraphicFramePr>
+            <a:graphic xmlns:a="http://schemas.openxmlformats.org/drawingml/2006/main">
+              <a:graphicData uri="http://schemas.openxmlformats.org/drawingml/2006/picture">
+                <pic:pic xmlns:pic="http://schemas.openxmlformats.org/drawingml/2006/picture">
+                  <pic:nvPicPr>
+                    <pic:cNvPr id="907063603" name=""/>
+                    <pic:cNvPicPr/>
+                  </pic:nvPicPr>
+                  <pic:blipFill>
+                    <a:blip r:embed="rId22"/>
+                    <a:stretch>
+                      <a:fillRect/>
+                    </a:stretch>
+                  </pic:blipFill>
+                  <pic:spPr>
+                    <a:xfrm>
+                      <a:off x="0" y="0"/>
+                      <a:ext cx="5612130" cy="1951990"/>
+                    </a:xfrm>
+                    <a:prstGeom prst="rect">
+                      <a:avLst/>
+                    </a:prstGeom>
+                  </pic:spPr>
+                </pic:pic>
+              </a:graphicData>
+            </a:graphic>
+          </wp:inline>
+        </w:drawing>
+      </w:r>
+    </w:p>
+    <w:p>
+      <w:pPr>
+        <w:pStyle w:val="Subttulo"/>
+        <w:rPr>
+          <w:rFonts w:ascii="Arial" w:hAnsi="Arial" w:cs="Arial"/>
+          <w:b/>
+          <w:bCs/>
+          <w:color w:val="000000" w:themeColor="text1"/>
+          <w:sz w:val="22"/>
+          <w:szCs w:val="22"/>
+        </w:rPr>
+      </w:pPr>
+      <w:r>
+        <w:rPr>
+          <w:rFonts w:ascii="Arial" w:hAnsi="Arial" w:cs="Arial"/>
+          <w:b/>
+          <w:bCs/>
+          <w:color w:val="000000" w:themeColor="text1"/>
+          <w:sz w:val="22"/>
+          <w:szCs w:val="22"/>
+        </w:rPr>
         <w:t>Referencias:</w:t>
       </w:r>
     </w:p>
@@ -6093,7 +6810,7 @@
       <w:r>
         <w:t xml:space="preserve">. Recuperado el 20 de octubre de 2026, de </w:t>
       </w:r>
-      <w:hyperlink r:id="rId6" w:history="1">
+      <w:hyperlink r:id="rId23" w:history="1">
         <w:r>
           <w:rPr>
             <w:rStyle w:val="Hipervnculo"/>
@@ -6128,7 +6845,7 @@
       <w:r>
         <w:t xml:space="preserve">. Recuperado el 20 de octubre de 2026, de </w:t>
       </w:r>
-      <w:hyperlink r:id="rId7" w:history="1">
+      <w:hyperlink r:id="rId24" w:history="1">
         <w:r>
           <w:rPr>
             <w:rStyle w:val="Hipervnculo"/>
@@ -6197,7 +6914,7 @@
       <w:r>
         <w:t xml:space="preserve">. Recuperado el 20 de octubre de 2026, de </w:t>
       </w:r>
-      <w:hyperlink r:id="rId8" w:history="1">
+      <w:hyperlink r:id="rId25" w:history="1">
         <w:r>
           <w:rPr>
             <w:rStyle w:val="Hipervnculo"/>
@@ -6238,7 +6955,7 @@
       <w:r>
         <w:t xml:space="preserve">Recuperado el 20 de octubre de 2026, de </w:t>
       </w:r>
-      <w:hyperlink r:id="rId9" w:history="1">
+      <w:hyperlink r:id="rId26" w:history="1">
         <w:r>
           <w:rPr>
             <w:rStyle w:val="Hipervnculo"/>
@@ -6273,28 +6990,15 @@
         </w:rPr>
         <w:t xml:space="preserve">. </w:t>
       </w:r>
-      <w:r>
-        <w:fldChar w:fldCharType="begin"/>
-      </w:r>
-      <w:r>
-        <w:rPr>
-          <w:lang w:val="pt-PT"/>
-        </w:rPr>
-        <w:instrText>HYPERLINK "https://cloudzero.com/blog/azure-blob-storage-pricing"</w:instrText>
-      </w:r>
-      <w:r>
-        <w:fldChar w:fldCharType="separate"/>
-      </w:r>
-      <w:r>
-        <w:rPr>
-          <w:rStyle w:val="Hipervnculo"/>
-          <w:lang w:val="pt-PT"/>
-        </w:rPr>
-        <w:t>https://cloudzero.com/blog/azure-blob-storage-pricing</w:t>
-      </w:r>
-      <w:r>
-        <w:fldChar w:fldCharType="end"/>
-      </w:r>
+      <w:hyperlink r:id="rId27" w:history="1">
+        <w:r>
+          <w:rPr>
+            <w:rStyle w:val="Hipervnculo"/>
+            <w:lang w:val="pt-PT"/>
+          </w:rPr>
+          <w:t>https://cloudzero.com/blog/azure-blob-storage-pricing</w:t>
+        </w:r>
+      </w:hyperlink>
     </w:p>
     <w:p>
       <w:r>
@@ -6330,7 +7034,7 @@
       <w:r>
         <w:t xml:space="preserve">Ayuda de Google Drive. Recuperado el 20 de octubre de 2026, de </w:t>
       </w:r>
-      <w:hyperlink r:id="rId10" w:history="1">
+      <w:hyperlink r:id="rId28" w:history="1">
         <w:r>
           <w:rPr>
             <w:rStyle w:val="Hipervnculo"/>
@@ -6379,7 +7083,7 @@
       <w:r>
         <w:t xml:space="preserve">. Recuperado el 20 de octubre de 2026, de </w:t>
       </w:r>
-      <w:hyperlink r:id="rId11" w:history="1">
+      <w:hyperlink r:id="rId29" w:history="1">
         <w:r>
           <w:rPr>
             <w:rStyle w:val="Hipervnculo"/>
@@ -6395,23 +7099,25 @@
         </w:rPr>
       </w:pPr>
       <w:r>
-        <w:t xml:space="preserve">Google </w:t>
+        <w:rPr>
+          <w:lang w:val="en-US"/>
+        </w:rPr>
+        <w:lastRenderedPageBreak/>
+        <w:t xml:space="preserve">Google Workspace Updates. (2026, 10 de </w:t>
       </w:r>
       <w:proofErr w:type="spellStart"/>
       <w:r>
-        <w:t>Workspace</w:t>
+        <w:rPr>
+          <w:lang w:val="en-US"/>
+        </w:rPr>
+        <w:t>septiembre</w:t>
       </w:r>
       <w:proofErr w:type="spellEnd"/>
       <w:r>
-        <w:t xml:space="preserve"> </w:t>
-      </w:r>
-      <w:proofErr w:type="spellStart"/>
-      <w:r>
-        <w:t>Updates</w:t>
-      </w:r>
-      <w:proofErr w:type="spellEnd"/>
-      <w:r>
-        <w:t xml:space="preserve">. (2026, 10 de septiembre). </w:t>
+        <w:rPr>
+          <w:lang w:val="en-US"/>
+        </w:rPr>
+        <w:t xml:space="preserve">). </w:t>
       </w:r>
       <w:r>
         <w:rPr>
@@ -6445,7 +7151,7 @@
         </w:rPr>
         <w:t xml:space="preserve">. Workspace Updates Blog. </w:t>
       </w:r>
-      <w:hyperlink r:id="rId12" w:history="1">
+      <w:hyperlink r:id="rId30" w:history="1">
         <w:r>
           <w:rPr>
             <w:rStyle w:val="Hipervnculo"/>
@@ -6478,7 +7184,7 @@
         </w:rPr>
         <w:t xml:space="preserve"> PCI Security Standards Council Blog. </w:t>
       </w:r>
-      <w:hyperlink r:id="rId13" w:history="1">
+      <w:hyperlink r:id="rId31" w:history="1">
         <w:r>
           <w:rPr>
             <w:rStyle w:val="Hipervnculo"/>
@@ -6493,7 +7199,6 @@
         <w:rPr>
           <w:lang w:val="en-US"/>
         </w:rPr>
-        <w:lastRenderedPageBreak/>
         <w:t xml:space="preserve">Microsoft. (s. f.). </w:t>
       </w:r>
       <w:r>
@@ -6513,7 +7218,7 @@
       <w:r>
         <w:t xml:space="preserve">Azure. Recuperado el 20 de octubre de 2026, de </w:t>
       </w:r>
-      <w:hyperlink r:id="rId14" w:history="1">
+      <w:hyperlink r:id="rId32" w:history="1">
         <w:r>
           <w:rPr>
             <w:rStyle w:val="Hipervnculo"/>
@@ -6546,7 +7251,7 @@
       <w:r>
         <w:t xml:space="preserve">Recuperado el 20 de octubre de 2026, de </w:t>
       </w:r>
-      <w:hyperlink r:id="rId15" w:history="1">
+      <w:hyperlink r:id="rId33" w:history="1">
         <w:r>
           <w:rPr>
             <w:rStyle w:val="Hipervnculo"/>
@@ -6576,7 +7281,7 @@
         </w:rPr>
         <w:t xml:space="preserve">. </w:t>
       </w:r>
-      <w:hyperlink r:id="rId16" w:history="1">
+      <w:hyperlink r:id="rId34" w:history="1">
         <w:r>
           <w:rPr>
             <w:rStyle w:val="Hipervnculo"/>

</xml_diff>

<commit_message>
copia de seguridad de documentacion
</commit_message>
<xml_diff>
--- a/Documentación/Documetación II Proyecto BD.docx
+++ b/Documentación/Documetación II Proyecto BD.docx
@@ -261,12 +261,9 @@
           <w:szCs w:val="28"/>
           <w:lang w:val="pt-PT"/>
         </w:rPr>
-        <w:t>Jacqueline Solís Céspedes</w:t>
-      </w:r>
-    </w:p>
-    <w:p>
-      <w:pPr>
-        <w:jc w:val="center"/>
+        <w:t xml:space="preserve">Prof. </w:t>
+      </w:r>
+      <w:r>
         <w:rPr>
           <w:rFonts w:ascii="Arial" w:hAnsi="Arial" w:cs="Arial"/>
           <w:color w:val="000000" w:themeColor="text1"/>
@@ -274,7 +271,8 @@
           <w:szCs w:val="28"/>
           <w:lang w:val="pt-PT"/>
         </w:rPr>
-      </w:pPr>
+        <w:t>Jacqueline Solís Céspedes</w:t>
+      </w:r>
     </w:p>
     <w:p>
       <w:pPr>
@@ -308,28 +306,29 @@
           <w:color w:val="000000" w:themeColor="text1"/>
           <w:sz w:val="28"/>
           <w:szCs w:val="28"/>
-        </w:rPr>
-      </w:pPr>
-      <w:r>
+          <w:lang w:val="pt-PT"/>
+        </w:rPr>
+      </w:pPr>
+    </w:p>
+    <w:p>
+      <w:pPr>
+        <w:jc w:val="center"/>
         <w:rPr>
           <w:rFonts w:ascii="Arial" w:hAnsi="Arial" w:cs="Arial"/>
           <w:color w:val="000000" w:themeColor="text1"/>
           <w:sz w:val="28"/>
           <w:szCs w:val="28"/>
         </w:rPr>
-        <w:t>Segundo semestre 2026</w:t>
-      </w:r>
-    </w:p>
-    <w:p>
-      <w:pPr>
-        <w:jc w:val="center"/>
+      </w:pPr>
+      <w:r>
         <w:rPr>
           <w:rFonts w:ascii="Arial" w:hAnsi="Arial" w:cs="Arial"/>
           <w:color w:val="000000" w:themeColor="text1"/>
           <w:sz w:val="28"/>
           <w:szCs w:val="28"/>
         </w:rPr>
-      </w:pPr>
+        <w:t>Segundo semestre 2026</w:t>
+      </w:r>
     </w:p>
     <w:p>
       <w:pPr>
@@ -363,6 +362,26 @@
           <w:szCs w:val="28"/>
         </w:rPr>
       </w:pPr>
+    </w:p>
+    <w:p>
+      <w:pPr>
+        <w:jc w:val="center"/>
+        <w:rPr>
+          <w:rFonts w:ascii="Arial" w:hAnsi="Arial" w:cs="Arial"/>
+          <w:color w:val="000000" w:themeColor="text1"/>
+          <w:sz w:val="28"/>
+          <w:szCs w:val="28"/>
+        </w:rPr>
+      </w:pPr>
+      <w:r>
+        <w:rPr>
+          <w:rFonts w:ascii="Arial" w:hAnsi="Arial" w:cs="Arial"/>
+          <w:color w:val="000000" w:themeColor="text1"/>
+          <w:sz w:val="28"/>
+          <w:szCs w:val="28"/>
+        </w:rPr>
+        <w:t xml:space="preserve">Fecha de entrega: </w:t>
+      </w:r>
       <w:r>
         <w:rPr>
           <w:rFonts w:ascii="Arial" w:hAnsi="Arial" w:cs="Arial"/>
@@ -7223,7 +7242,7 @@
           <w:noProof/>
         </w:rPr>
         <w:drawing>
-          <wp:inline distT="0" distB="0" distL="0" distR="0" wp14:anchorId="1E79F9B9" wp14:editId="3ED34941">
+          <wp:inline distT="0" distB="0" distL="0" distR="0" wp14:anchorId="1E79F9B9" wp14:editId="47175510">
             <wp:extent cx="5317142" cy="6753225"/>
             <wp:effectExtent l="0" t="0" r="0" b="0"/>
             <wp:docPr id="1443851057" name="Imagen 1"/>
@@ -17077,6 +17096,7 @@
               <w:rPr>
                 <w:rFonts w:ascii="Arial" w:hAnsi="Arial" w:cs="Arial"/>
               </w:rPr>
+              <w:lastRenderedPageBreak/>
               <w:t>RN-19</w:t>
             </w:r>
           </w:p>
@@ -21798,6 +21818,7 @@
       <w:r>
         <w:rPr>
           <w:rFonts w:ascii="Arial" w:hAnsi="Arial" w:cs="Arial"/>
+          <w:lang w:val="pt-BR"/>
         </w:rPr>
         <w:t>CloudZero</w:t>
       </w:r>
@@ -21805,6 +21826,7 @@
       <w:r>
         <w:rPr>
           <w:rFonts w:ascii="Arial" w:hAnsi="Arial" w:cs="Arial"/>
+          <w:lang w:val="pt-BR"/>
         </w:rPr>
         <w:t xml:space="preserve">. </w:t>
       </w:r>
@@ -24161,6 +24183,7 @@
   <w:style w:type="character" w:default="1" w:styleId="Fuentedeprrafopredeter">
     <w:name w:val="Default Paragraph Font"/>
     <w:uiPriority w:val="1"/>
+    <w:semiHidden/>
     <w:unhideWhenUsed/>
   </w:style>
   <w:style w:type="table" w:default="1" w:styleId="Tablanormal">

</xml_diff>